<commit_message>
Updated Chain_APIs spec with authorization requirements. Described Authentication methods in Authentication.txt.
</commit_message>
<xml_diff>
--- a/Portal_Database_Design/APIs/Chain_APIs.docx
+++ b/Portal_Database_Design/APIs/Chain_APIs.docx
@@ -16,18 +16,18 @@
         </w:tblCellMar>
       </w:tblPr>
       <w:tblGrid>
-        <w:gridCol w:w="1598"/>
-        <w:gridCol w:w="1614"/>
+        <w:gridCol w:w="1596"/>
+        <w:gridCol w:w="1616"/>
         <w:gridCol w:w="1601"/>
         <w:gridCol w:w="1612"/>
-        <w:gridCol w:w="1606"/>
         <w:gridCol w:w="1607"/>
+        <w:gridCol w:w="1605"/>
       </w:tblGrid>
       <w:tr>
         <w:trPr/>
         <w:tc>
           <w:tcPr>
-            <w:tcW w:w="1598" w:type="dxa"/>
+            <w:tcW w:w="1596" w:type="dxa"/>
             <w:tcBorders>
               <w:top w:val="single" w:sz="4" w:space="0" w:color="000000"/>
               <w:start w:val="single" w:sz="4" w:space="0" w:color="000000"/>
@@ -77,7 +77,7 @@
         </w:tc>
         <w:tc>
           <w:tcPr>
-            <w:tcW w:w="1614" w:type="dxa"/>
+            <w:tcW w:w="1616" w:type="dxa"/>
             <w:tcBorders>
               <w:top w:val="single" w:sz="4" w:space="0" w:color="000000"/>
               <w:start w:val="single" w:sz="4" w:space="0" w:color="000000"/>
@@ -227,7 +227,7 @@
         </w:tc>
         <w:tc>
           <w:tcPr>
-            <w:tcW w:w="1606" w:type="dxa"/>
+            <w:tcW w:w="1607" w:type="dxa"/>
             <w:tcBorders>
               <w:top w:val="single" w:sz="4" w:space="0" w:color="000000"/>
               <w:start w:val="single" w:sz="4" w:space="0" w:color="000000"/>
@@ -277,7 +277,7 @@
         </w:tc>
         <w:tc>
           <w:tcPr>
-            <w:tcW w:w="1607" w:type="dxa"/>
+            <w:tcW w:w="1605" w:type="dxa"/>
             <w:tcBorders>
               <w:top w:val="single" w:sz="4" w:space="0" w:color="000000"/>
               <w:start w:val="single" w:sz="4" w:space="0" w:color="000000"/>
@@ -331,7 +331,7 @@
         <w:trPr/>
         <w:tc>
           <w:tcPr>
-            <w:tcW w:w="1598" w:type="dxa"/>
+            <w:tcW w:w="1596" w:type="dxa"/>
             <w:tcBorders>
               <w:start w:val="single" w:sz="4" w:space="0" w:color="000000"/>
               <w:bottom w:val="single" w:sz="4" w:space="0" w:color="000000"/>
@@ -380,7 +380,7 @@
         </w:tc>
         <w:tc>
           <w:tcPr>
-            <w:tcW w:w="1614" w:type="dxa"/>
+            <w:tcW w:w="1616" w:type="dxa"/>
             <w:tcBorders>
               <w:start w:val="single" w:sz="4" w:space="0" w:color="000000"/>
               <w:bottom w:val="single" w:sz="4" w:space="0" w:color="000000"/>
@@ -527,7 +527,7 @@
         </w:tc>
         <w:tc>
           <w:tcPr>
-            <w:tcW w:w="1606" w:type="dxa"/>
+            <w:tcW w:w="1607" w:type="dxa"/>
             <w:tcBorders>
               <w:start w:val="single" w:sz="4" w:space="0" w:color="000000"/>
               <w:bottom w:val="single" w:sz="4" w:space="0" w:color="000000"/>
@@ -576,7 +576,7 @@
         </w:tc>
         <w:tc>
           <w:tcPr>
-            <w:tcW w:w="1607" w:type="dxa"/>
+            <w:tcW w:w="1605" w:type="dxa"/>
             <w:tcBorders>
               <w:start w:val="single" w:sz="4" w:space="0" w:color="000000"/>
               <w:bottom w:val="single" w:sz="4" w:space="0" w:color="000000"/>
@@ -648,7 +648,7 @@
         <w:trPr/>
         <w:tc>
           <w:tcPr>
-            <w:tcW w:w="1598" w:type="dxa"/>
+            <w:tcW w:w="1596" w:type="dxa"/>
             <w:tcBorders>
               <w:start w:val="single" w:sz="4" w:space="0" w:color="000000"/>
               <w:bottom w:val="single" w:sz="4" w:space="0" w:color="000000"/>
@@ -697,7 +697,7 @@
         </w:tc>
         <w:tc>
           <w:tcPr>
-            <w:tcW w:w="1614" w:type="dxa"/>
+            <w:tcW w:w="1616" w:type="dxa"/>
             <w:tcBorders>
               <w:start w:val="single" w:sz="4" w:space="0" w:color="000000"/>
               <w:bottom w:val="single" w:sz="4" w:space="0" w:color="000000"/>
@@ -844,7 +844,7 @@
         </w:tc>
         <w:tc>
           <w:tcPr>
-            <w:tcW w:w="1606" w:type="dxa"/>
+            <w:tcW w:w="1607" w:type="dxa"/>
             <w:tcBorders>
               <w:start w:val="single" w:sz="4" w:space="0" w:color="000000"/>
               <w:bottom w:val="single" w:sz="4" w:space="0" w:color="000000"/>
@@ -893,7 +893,7 @@
         </w:tc>
         <w:tc>
           <w:tcPr>
-            <w:tcW w:w="1607" w:type="dxa"/>
+            <w:tcW w:w="1605" w:type="dxa"/>
             <w:tcBorders>
               <w:start w:val="single" w:sz="4" w:space="0" w:color="000000"/>
               <w:bottom w:val="single" w:sz="4" w:space="0" w:color="000000"/>
@@ -965,7 +965,7 @@
         <w:trPr/>
         <w:tc>
           <w:tcPr>
-            <w:tcW w:w="1598" w:type="dxa"/>
+            <w:tcW w:w="1596" w:type="dxa"/>
             <w:tcBorders>
               <w:start w:val="single" w:sz="4" w:space="0" w:color="000000"/>
               <w:bottom w:val="single" w:sz="4" w:space="0" w:color="000000"/>
@@ -1014,7 +1014,7 @@
         </w:tc>
         <w:tc>
           <w:tcPr>
-            <w:tcW w:w="1614" w:type="dxa"/>
+            <w:tcW w:w="1616" w:type="dxa"/>
             <w:tcBorders>
               <w:start w:val="single" w:sz="4" w:space="0" w:color="000000"/>
               <w:bottom w:val="single" w:sz="4" w:space="0" w:color="000000"/>
@@ -1161,7 +1161,7 @@
         </w:tc>
         <w:tc>
           <w:tcPr>
-            <w:tcW w:w="1606" w:type="dxa"/>
+            <w:tcW w:w="1607" w:type="dxa"/>
             <w:tcBorders>
               <w:start w:val="single" w:sz="4" w:space="0" w:color="000000"/>
               <w:bottom w:val="single" w:sz="4" w:space="0" w:color="000000"/>
@@ -1210,7 +1210,7 @@
         </w:tc>
         <w:tc>
           <w:tcPr>
-            <w:tcW w:w="1607" w:type="dxa"/>
+            <w:tcW w:w="1605" w:type="dxa"/>
             <w:tcBorders>
               <w:start w:val="single" w:sz="4" w:space="0" w:color="000000"/>
               <w:bottom w:val="single" w:sz="4" w:space="0" w:color="000000"/>
@@ -1282,7 +1282,7 @@
         <w:trPr/>
         <w:tc>
           <w:tcPr>
-            <w:tcW w:w="1598" w:type="dxa"/>
+            <w:tcW w:w="1596" w:type="dxa"/>
             <w:tcBorders>
               <w:start w:val="single" w:sz="4" w:space="0" w:color="000000"/>
               <w:bottom w:val="single" w:sz="4" w:space="0" w:color="000000"/>
@@ -1331,7 +1331,7 @@
         </w:tc>
         <w:tc>
           <w:tcPr>
-            <w:tcW w:w="1614" w:type="dxa"/>
+            <w:tcW w:w="1616" w:type="dxa"/>
             <w:tcBorders>
               <w:start w:val="single" w:sz="4" w:space="0" w:color="000000"/>
               <w:bottom w:val="single" w:sz="4" w:space="0" w:color="000000"/>
@@ -1472,13 +1472,13 @@
                 <w:szCs w:val="24"/>
                 <w:u w:val="none"/>
               </w:rPr>
-              <w:t>id</w:t>
-            </w:r>
-          </w:p>
-        </w:tc>
-        <w:tc>
-          <w:tcPr>
-            <w:tcW w:w="1606" w:type="dxa"/>
+              <w:t>chainId</w:t>
+            </w:r>
+          </w:p>
+        </w:tc>
+        <w:tc>
+          <w:tcPr>
+            <w:tcW w:w="1607" w:type="dxa"/>
             <w:tcBorders>
               <w:start w:val="single" w:sz="4" w:space="0" w:color="000000"/>
               <w:bottom w:val="single" w:sz="4" w:space="0" w:color="000000"/>
@@ -1527,7 +1527,7 @@
         </w:tc>
         <w:tc>
           <w:tcPr>
-            <w:tcW w:w="1607" w:type="dxa"/>
+            <w:tcW w:w="1605" w:type="dxa"/>
             <w:tcBorders>
               <w:start w:val="single" w:sz="4" w:space="0" w:color="000000"/>
               <w:bottom w:val="single" w:sz="4" w:space="0" w:color="000000"/>
@@ -1582,7 +1582,7 @@
         </w:trPr>
         <w:tc>
           <w:tcPr>
-            <w:tcW w:w="1598" w:type="dxa"/>
+            <w:tcW w:w="1596" w:type="dxa"/>
             <w:tcBorders>
               <w:start w:val="single" w:sz="4" w:space="0" w:color="000000"/>
               <w:bottom w:val="single" w:sz="4" w:space="0" w:color="000000"/>
@@ -1631,7 +1631,7 @@
         </w:tc>
         <w:tc>
           <w:tcPr>
-            <w:tcW w:w="1614" w:type="dxa"/>
+            <w:tcW w:w="1616" w:type="dxa"/>
             <w:tcBorders>
               <w:start w:val="single" w:sz="4" w:space="0" w:color="000000"/>
               <w:bottom w:val="single" w:sz="4" w:space="0" w:color="000000"/>
@@ -1778,7 +1778,7 @@
         </w:tc>
         <w:tc>
           <w:tcPr>
-            <w:tcW w:w="1606" w:type="dxa"/>
+            <w:tcW w:w="1607" w:type="dxa"/>
             <w:tcBorders>
               <w:start w:val="single" w:sz="4" w:space="0" w:color="000000"/>
               <w:bottom w:val="single" w:sz="4" w:space="0" w:color="000000"/>
@@ -1827,7 +1827,7 @@
         </w:tc>
         <w:tc>
           <w:tcPr>
-            <w:tcW w:w="1607" w:type="dxa"/>
+            <w:tcW w:w="1605" w:type="dxa"/>
             <w:tcBorders>
               <w:start w:val="single" w:sz="4" w:space="0" w:color="000000"/>
               <w:bottom w:val="single" w:sz="4" w:space="0" w:color="000000"/>
@@ -1882,7 +1882,7 @@
         <w:trPr/>
         <w:tc>
           <w:tcPr>
-            <w:tcW w:w="1598" w:type="dxa"/>
+            <w:tcW w:w="1596" w:type="dxa"/>
             <w:tcBorders>
               <w:start w:val="single" w:sz="4" w:space="0" w:color="000000"/>
               <w:bottom w:val="single" w:sz="4" w:space="0" w:color="000000"/>
@@ -1931,7 +1931,7 @@
         </w:tc>
         <w:tc>
           <w:tcPr>
-            <w:tcW w:w="1614" w:type="dxa"/>
+            <w:tcW w:w="1616" w:type="dxa"/>
             <w:tcBorders>
               <w:start w:val="single" w:sz="4" w:space="0" w:color="000000"/>
               <w:bottom w:val="single" w:sz="4" w:space="0" w:color="000000"/>
@@ -2078,7 +2078,7 @@
         </w:tc>
         <w:tc>
           <w:tcPr>
-            <w:tcW w:w="1606" w:type="dxa"/>
+            <w:tcW w:w="1607" w:type="dxa"/>
             <w:tcBorders>
               <w:start w:val="single" w:sz="4" w:space="0" w:color="000000"/>
               <w:bottom w:val="single" w:sz="4" w:space="0" w:color="000000"/>
@@ -2127,7 +2127,7 @@
         </w:tc>
         <w:tc>
           <w:tcPr>
-            <w:tcW w:w="1607" w:type="dxa"/>
+            <w:tcW w:w="1605" w:type="dxa"/>
             <w:tcBorders>
               <w:start w:val="single" w:sz="4" w:space="0" w:color="000000"/>
               <w:bottom w:val="single" w:sz="4" w:space="0" w:color="000000"/>
@@ -2184,7 +2184,7 @@
         <w:trPr/>
         <w:tc>
           <w:tcPr>
-            <w:tcW w:w="1598" w:type="dxa"/>
+            <w:tcW w:w="1596" w:type="dxa"/>
             <w:tcBorders>
               <w:start w:val="single" w:sz="4" w:space="0" w:color="000000"/>
               <w:bottom w:val="single" w:sz="4" w:space="0" w:color="000000"/>
@@ -2233,7 +2233,7 @@
         </w:tc>
         <w:tc>
           <w:tcPr>
-            <w:tcW w:w="1614" w:type="dxa"/>
+            <w:tcW w:w="1616" w:type="dxa"/>
             <w:tcBorders>
               <w:start w:val="single" w:sz="4" w:space="0" w:color="000000"/>
               <w:bottom w:val="single" w:sz="4" w:space="0" w:color="000000"/>
@@ -2380,7 +2380,7 @@
         </w:tc>
         <w:tc>
           <w:tcPr>
-            <w:tcW w:w="1606" w:type="dxa"/>
+            <w:tcW w:w="1607" w:type="dxa"/>
             <w:tcBorders>
               <w:start w:val="single" w:sz="4" w:space="0" w:color="000000"/>
               <w:bottom w:val="single" w:sz="4" w:space="0" w:color="000000"/>
@@ -2429,7 +2429,7 @@
         </w:tc>
         <w:tc>
           <w:tcPr>
-            <w:tcW w:w="1607" w:type="dxa"/>
+            <w:tcW w:w="1605" w:type="dxa"/>
             <w:tcBorders>
               <w:start w:val="single" w:sz="4" w:space="0" w:color="000000"/>
               <w:bottom w:val="single" w:sz="4" w:space="0" w:color="000000"/>
@@ -2473,7 +2473,7 @@
                 <w:szCs w:val="24"/>
                 <w:u w:val="none"/>
               </w:rPr>
-              <w:t>A chain can only be removed by a comapny_manager or a chain_manager. The logged_in user’s user_role should be checked.</w:t>
+              <w:t>A chain can only be removed by a company_manager or a chain_manager. The logged_in user’s user_role should be checked.</w:t>
             </w:r>
           </w:p>
         </w:tc>
@@ -2518,12 +2518,16 @@
           <w:bCs w:val="false"/>
         </w:rPr>
       </w:pPr>
+      <w:bookmarkStart w:id="6" w:name="__DdeLink__264_761320732"/>
+      <w:bookmarkStart w:id="7" w:name="__DdeLink__251_1626357650"/>
+      <w:bookmarkStart w:id="8" w:name="__DdeLink__261_1626357650"/>
+      <w:bookmarkStart w:id="9" w:name="__DdeLink__240_1626357650"/>
       <w:r>
         <w:rPr>
           <w:b w:val="false"/>
           <w:bCs w:val="false"/>
         </w:rPr>
-        <w:t>createChain -&gt; Takes all the details of a CHAIN record from the front-end [chain_related and chain_address related.] and creates a CHAIN record.</w:t>
+        <w:t>createChain -&gt; Takes all the details of a CHAIN record from the front-end [chain_related and chain_address related.] and creates a CHAIN record. This can be done only by a company manager.</w:t>
       </w:r>
     </w:p>
     <w:p>
@@ -2558,25 +2562,26 @@
           <w:b w:val="false"/>
           <w:bCs w:val="false"/>
         </w:rPr>
-        <w:t>updateChainName -&gt; Takes the chain_name from the DTO, the chain_id from the URL param, both from the front-end and updates the chain_name of the respective CHAIN record.</w:t>
-      </w:r>
-    </w:p>
-    <w:p>
-      <w:pPr>
-        <w:pStyle w:val="Normal"/>
-        <w:bidi w:val="0"/>
-        <w:jc w:val="both"/>
+        <w:t xml:space="preserve">updateChainName -&gt; Takes the chain_name from the DTO, the chain_id from the URL param, both from the front-end and updates the chain_name of the respective CHAIN record. </w:t>
+      </w:r>
+      <w:bookmarkStart w:id="10" w:name="__DdeLink__229_1626357650"/>
+      <w:r>
         <w:rPr>
           <w:b w:val="false"/>
           <w:bCs w:val="false"/>
         </w:rPr>
-      </w:pPr>
+        <w:t xml:space="preserve">This can only be done by a company_manager or a chain_manager. If it is being done by a chain_manager, then that chain_manager must belong to an outlet of the chain which is having its name updated. </w:t>
+      </w:r>
+      <w:bookmarkStart w:id="11" w:name="__DdeLink__242_1626357650"/>
+      <w:bookmarkEnd w:id="10"/>
       <w:r>
         <w:rPr>
           <w:b w:val="false"/>
           <w:bCs w:val="false"/>
         </w:rPr>
-      </w:r>
+        <w:t>Note that a join between OUTLETS, CHAINS and USERS would have to be done to get the chain to which the chain_manager belongs.</w:t>
+      </w:r>
+      <w:bookmarkEnd w:id="11"/>
     </w:p>
     <w:p>
       <w:pPr>
@@ -2593,7 +2598,6 @@
           <w:b w:val="false"/>
           <w:bCs w:val="false"/>
         </w:rPr>
-        <w:t>updateChainAddress -&gt; Takes the chain_address_* related fields from the DTO, the chain_id from the URL param from the front-end and updates the chain_address_* related fields of the respective CHAIN record.</w:t>
       </w:r>
     </w:p>
     <w:p>
@@ -2611,43 +2615,41 @@
           <w:b w:val="false"/>
           <w:bCs w:val="false"/>
         </w:rPr>
-      </w:r>
-    </w:p>
-    <w:p>
-      <w:pPr>
-        <w:pStyle w:val="Normal"/>
-        <w:bidi w:val="0"/>
-        <w:jc w:val="both"/>
+        <w:t xml:space="preserve">updateChainAddress -&gt; Takes the chain_address_* related fields from the DTO, the chain_id from the URL param from the front-end and updates the chain_address_* related fields of the respective CHAIN record. </w:t>
+      </w:r>
+      <w:bookmarkStart w:id="12" w:name="__DdeLink__233_1626357650"/>
+      <w:r>
         <w:rPr>
           <w:b w:val="false"/>
           <w:bCs w:val="false"/>
         </w:rPr>
-      </w:pPr>
-      <w:bookmarkStart w:id="6" w:name="__DdeLink__149_588342144"/>
+        <w:t xml:space="preserve">This can only be done by a company_manager or a chain_manager. </w:t>
+      </w:r>
+      <w:bookmarkEnd w:id="12"/>
       <w:r>
         <w:rPr>
           <w:b w:val="false"/>
           <w:bCs w:val="false"/>
         </w:rPr>
-        <w:t xml:space="preserve">findOneChain -&gt; Takes the </w:t>
-      </w:r>
-      <w:bookmarkStart w:id="7" w:name="__DdeLink__443_1184157458"/>
-      <w:r>
+        <w:t>If it is being done by a chain_manager, then that chain_manager must belong to an outlet of the chain which is having its chain_address_* field updated. Note that a join between OUTLETS, CHAINS and USERS would have to be done to get the chain to which the chain_manager belongs.</w:t>
+      </w:r>
+    </w:p>
+    <w:p>
+      <w:pPr>
+        <w:pStyle w:val="Normal"/>
+        <w:bidi w:val="0"/>
+        <w:jc w:val="both"/>
         <w:rPr>
           <w:b w:val="false"/>
           <w:bCs w:val="false"/>
         </w:rPr>
-        <w:t>chain_id from the URL parameter from the front-end</w:t>
-      </w:r>
-      <w:bookmarkEnd w:id="7"/>
+      </w:pPr>
       <w:r>
         <w:rPr>
           <w:b w:val="false"/>
           <w:bCs w:val="false"/>
         </w:rPr>
-        <w:t xml:space="preserve"> and returns the respective CHAIN record.</w:t>
-      </w:r>
-      <w:bookmarkEnd w:id="6"/>
+      </w:r>
     </w:p>
     <w:p>
       <w:pPr>
@@ -2659,47 +2661,47 @@
           <w:bCs w:val="false"/>
         </w:rPr>
       </w:pPr>
+      <w:bookmarkStart w:id="13" w:name="__DdeLink__149_588342144"/>
       <w:r>
         <w:rPr>
           <w:b w:val="false"/>
           <w:bCs w:val="false"/>
         </w:rPr>
-      </w:r>
-    </w:p>
-    <w:p>
-      <w:pPr>
-        <w:pStyle w:val="Normal"/>
-        <w:bidi w:val="0"/>
-        <w:jc w:val="both"/>
+        <w:t xml:space="preserve">findOneChain -&gt; Takes the </w:t>
+      </w:r>
+      <w:bookmarkStart w:id="14" w:name="__DdeLink__443_1184157458"/>
+      <w:r>
         <w:rPr>
           <w:b w:val="false"/>
           <w:bCs w:val="false"/>
         </w:rPr>
-      </w:pPr>
+        <w:t>chain_id from the URL parameter from the front-end</w:t>
+      </w:r>
+      <w:bookmarkEnd w:id="14"/>
       <w:r>
         <w:rPr>
           <w:b w:val="false"/>
           <w:bCs w:val="false"/>
         </w:rPr>
-        <w:t>findAllChains -&gt; Takes no input from the front-end and returns all CHAIN records.</w:t>
-      </w:r>
-    </w:p>
-    <w:p>
-      <w:pPr>
-        <w:pStyle w:val="Normal"/>
-        <w:bidi w:val="0"/>
-        <w:jc w:val="both"/>
+        <w:t xml:space="preserve"> and returns the respective CHAIN record.</w:t>
+      </w:r>
+      <w:bookmarkEnd w:id="13"/>
+      <w:r>
         <w:rPr>
           <w:b w:val="false"/>
           <w:bCs w:val="false"/>
         </w:rPr>
-      </w:pPr>
+        <w:t xml:space="preserve"> </w:t>
+      </w:r>
+      <w:bookmarkStart w:id="15" w:name="__DdeLink__231_1626357650"/>
       <w:r>
         <w:rPr>
           <w:b w:val="false"/>
           <w:bCs w:val="false"/>
         </w:rPr>
-      </w:r>
+        <w:t>Users of all user_roles can use findOneChain.</w:t>
+      </w:r>
+      <w:bookmarkEnd w:id="15"/>
     </w:p>
     <w:p>
       <w:pPr>
@@ -2716,85 +2718,72 @@
           <w:b w:val="false"/>
           <w:bCs w:val="false"/>
         </w:rPr>
-        <w:t>removeChain  -&gt; Takes the   chain_id from the URL parameter from the front-end, deletes the respective CHAIN record and returns the deleted CHAIN record.</w:t>
-      </w:r>
-    </w:p>
-    <w:p>
-      <w:pPr>
-        <w:pStyle w:val="Normal"/>
-        <w:bidi w:val="0"/>
-        <w:jc w:val="center"/>
-        <w:rPr/>
-      </w:pPr>
-      <w:r>
-        <w:rPr/>
-      </w:r>
-    </w:p>
-    <w:p>
-      <w:pPr>
-        <w:pStyle w:val="Normal"/>
-        <w:bidi w:val="0"/>
-        <w:jc w:val="center"/>
-        <w:rPr/>
-      </w:pPr>
-      <w:r>
-        <w:rPr/>
-      </w:r>
-    </w:p>
-    <w:p>
-      <w:pPr>
-        <w:pStyle w:val="Normal"/>
-        <w:bidi w:val="0"/>
-        <w:jc w:val="center"/>
-        <w:rPr/>
-      </w:pPr>
-      <w:r>
-        <w:rPr/>
-      </w:r>
-    </w:p>
-    <w:p>
-      <w:pPr>
-        <w:pStyle w:val="Normal"/>
-        <w:bidi w:val="0"/>
-        <w:jc w:val="center"/>
-        <w:rPr/>
-      </w:pPr>
-      <w:r>
-        <w:rPr/>
-      </w:r>
-    </w:p>
-    <w:p>
-      <w:pPr>
-        <w:pStyle w:val="Normal"/>
-        <w:bidi w:val="0"/>
-        <w:jc w:val="center"/>
-        <w:rPr/>
-      </w:pPr>
-      <w:r>
-        <w:rPr/>
-      </w:r>
-    </w:p>
-    <w:p>
-      <w:pPr>
-        <w:pStyle w:val="Normal"/>
-        <w:bidi w:val="0"/>
-        <w:jc w:val="center"/>
-        <w:rPr/>
-      </w:pPr>
-      <w:r>
-        <w:rPr/>
-      </w:r>
-    </w:p>
-    <w:p>
-      <w:pPr>
-        <w:pStyle w:val="Normal"/>
-        <w:bidi w:val="0"/>
-        <w:jc w:val="center"/>
-        <w:rPr/>
-      </w:pPr>
-      <w:r>
-        <w:rPr/>
-      </w:r>
+      </w:r>
+    </w:p>
+    <w:p>
+      <w:pPr>
+        <w:pStyle w:val="Normal"/>
+        <w:bidi w:val="0"/>
+        <w:jc w:val="both"/>
+        <w:rPr>
+          <w:b w:val="false"/>
+          <w:bCs w:val="false"/>
+        </w:rPr>
+      </w:pPr>
+      <w:r>
+        <w:rPr>
+          <w:b w:val="false"/>
+          <w:bCs w:val="false"/>
+        </w:rPr>
+        <w:t>findAllChains -&gt; Takes no input from the front-end and returns all CHAIN records. Users of all user_roles can use findAllChains.</w:t>
+      </w:r>
+    </w:p>
+    <w:p>
+      <w:pPr>
+        <w:pStyle w:val="Normal"/>
+        <w:bidi w:val="0"/>
+        <w:jc w:val="both"/>
+        <w:rPr>
+          <w:b w:val="false"/>
+          <w:bCs w:val="false"/>
+        </w:rPr>
+      </w:pPr>
+      <w:r>
+        <w:rPr>
+          <w:b w:val="false"/>
+          <w:bCs w:val="false"/>
+        </w:rPr>
+      </w:r>
+    </w:p>
+    <w:p>
+      <w:pPr>
+        <w:pStyle w:val="Normal"/>
+        <w:bidi w:val="0"/>
+        <w:jc w:val="both"/>
+        <w:rPr>
+          <w:b w:val="false"/>
+          <w:bCs w:val="false"/>
+        </w:rPr>
+      </w:pPr>
+      <w:bookmarkStart w:id="16" w:name="__DdeLink__240_1626357650"/>
+      <w:r>
+        <w:rPr>
+          <w:b w:val="false"/>
+          <w:bCs w:val="false"/>
+        </w:rPr>
+        <w:t>removeChain  -&gt; Takes the chain_id from the URL parameter from the front-end, deletes the respective CHAIN record and returns the deleted CHAIN record. This can only be done by a company_manager or a chain_manager. If it is done by a chain_manager, then that chain_manager must belong to an outlet of the chain which is being removed.</w:t>
+      </w:r>
+      <w:bookmarkEnd w:id="16"/>
+      <w:r>
+        <w:rPr>
+          <w:b w:val="false"/>
+          <w:bCs w:val="false"/>
+        </w:rPr>
+        <w:t xml:space="preserve"> Note that a join between OUTLETS, CHAINS and USERS would have to be done to get the chain to which the chain_manager belongs.</w:t>
+      </w:r>
+      <w:bookmarkEnd w:id="6"/>
+      <w:bookmarkEnd w:id="7"/>
+      <w:bookmarkEnd w:id="8"/>
     </w:p>
     <w:p>
       <w:pPr>
@@ -2957,12 +2946,12 @@
         <w:jc w:val="start"/>
         <w:rPr/>
       </w:pPr>
-      <w:bookmarkStart w:id="8" w:name="__DdeLink__92_3803631280"/>
+      <w:bookmarkStart w:id="17" w:name="__DdeLink__92_3803631280"/>
       <w:r>
         <w:rPr/>
         <w:t>* Create a CHAIN tuple without the chain_headquarters_address_city.</w:t>
       </w:r>
-      <w:bookmarkEnd w:id="8"/>
+      <w:bookmarkEnd w:id="17"/>
     </w:p>
     <w:p>
       <w:pPr>
@@ -3065,12 +3054,12 @@
         <w:jc w:val="start"/>
         <w:rPr/>
       </w:pPr>
-      <w:bookmarkStart w:id="9" w:name="__DdeLink__100_3803631280"/>
+      <w:bookmarkStart w:id="18" w:name="__DdeLink__100_3803631280"/>
       <w:r>
         <w:rPr/>
         <w:t>For UpdateChainAddress, the following tests:</w:t>
       </w:r>
-      <w:bookmarkEnd w:id="9"/>
+      <w:bookmarkEnd w:id="18"/>
     </w:p>
     <w:p>
       <w:pPr>
@@ -3091,12 +3080,12 @@
         <w:jc w:val="start"/>
         <w:rPr/>
       </w:pPr>
-      <w:bookmarkStart w:id="10" w:name="__DdeLink__94_3803631280"/>
+      <w:bookmarkStart w:id="19" w:name="__DdeLink__94_3803631280"/>
       <w:r>
         <w:rPr/>
         <w:t>* Update the CHAIN’s chain_headquarters_address_city.</w:t>
       </w:r>
-      <w:bookmarkEnd w:id="10"/>
+      <w:bookmarkEnd w:id="19"/>
     </w:p>
     <w:p>
       <w:pPr>
@@ -3109,12 +3098,12 @@
         <w:rPr/>
         <w:t xml:space="preserve">* </w:t>
       </w:r>
-      <w:bookmarkStart w:id="11" w:name="__DdeLink__96_3803631280"/>
+      <w:bookmarkStart w:id="20" w:name="__DdeLink__96_3803631280"/>
       <w:r>
         <w:rPr/>
         <w:t>Update the CHAIN’s chain_headquarters_address_street</w:t>
       </w:r>
-      <w:bookmarkEnd w:id="11"/>
+      <w:bookmarkEnd w:id="20"/>
       <w:r>
         <w:rPr/>
         <w:t>.</w:t>
@@ -3127,12 +3116,12 @@
         <w:jc w:val="start"/>
         <w:rPr/>
       </w:pPr>
-      <w:bookmarkStart w:id="12" w:name="__DdeLink__98_3803631280"/>
+      <w:bookmarkStart w:id="21" w:name="__DdeLink__98_3803631280"/>
       <w:r>
         <w:rPr/>
         <w:t>* Update the CHAIN’s chain_headquarters_address_country.</w:t>
       </w:r>
-      <w:bookmarkEnd w:id="12"/>
+      <w:bookmarkEnd w:id="21"/>
     </w:p>
     <w:p>
       <w:pPr>
@@ -3212,16 +3201,16 @@
         <w:jc w:val="start"/>
         <w:rPr/>
       </w:pPr>
-      <w:bookmarkStart w:id="13" w:name="__DdeLink__139_2312781727"/>
-      <w:bookmarkStart w:id="14" w:name="__DdeLink__142_2312781727"/>
-      <w:bookmarkStart w:id="15" w:name="__DdeLink__296_1992960000"/>
+      <w:bookmarkStart w:id="22" w:name="__DdeLink__139_2312781727"/>
+      <w:bookmarkStart w:id="23" w:name="__DdeLink__142_2312781727"/>
+      <w:bookmarkStart w:id="24" w:name="__DdeLink__296_1992960000"/>
       <w:r>
         <w:rPr/>
         <w:t>* Delete the CHAIN with chain_id 12.</w:t>
       </w:r>
-      <w:bookmarkEnd w:id="13"/>
-      <w:bookmarkEnd w:id="14"/>
-      <w:bookmarkEnd w:id="15"/>
+      <w:bookmarkEnd w:id="22"/>
+      <w:bookmarkEnd w:id="23"/>
+      <w:bookmarkEnd w:id="24"/>
     </w:p>
     <w:p>
       <w:pPr>
@@ -3270,12 +3259,12 @@
         <w:jc w:val="start"/>
         <w:rPr/>
       </w:pPr>
-      <w:bookmarkStart w:id="16" w:name="__DdeLink__138_2894387740"/>
+      <w:bookmarkStart w:id="25" w:name="__DdeLink__138_2894387740"/>
       <w:r>
         <w:rPr/>
         <w:t>* Add another CHAIN named “Test Chain” with the following details (chain_date_created_at, chain_headquarters_address_room_no, chain_headquarters_address_building, chain_headquarters_address_street, chain_headquarters_address_city, chain_headquarters_address_admin_division, chain_headquarters_address_country, chain_headquarters_address_post_code) (Test Chain', '14, 'Test Building 2', 'Test Street 2', 'Test City Two', 'Test Division Twoo', 'India', '560001)</w:t>
       </w:r>
-      <w:bookmarkEnd w:id="16"/>
+      <w:bookmarkEnd w:id="25"/>
     </w:p>
     <w:p>
       <w:pPr>
@@ -3344,14 +3333,14 @@
         <w:jc w:val="start"/>
         <w:rPr/>
       </w:pPr>
-      <w:bookmarkStart w:id="17" w:name="__DdeLink__136_2894387740"/>
-      <w:bookmarkStart w:id="18" w:name="__DdeLink__133_2894387740"/>
+      <w:bookmarkStart w:id="26" w:name="__DdeLink__136_2894387740"/>
+      <w:bookmarkStart w:id="27" w:name="__DdeLink__133_2894387740"/>
       <w:r>
         <w:rPr/>
         <w:t>NOTE: “Test Chain” has chain_ id = 4.</w:t>
       </w:r>
-      <w:bookmarkEnd w:id="17"/>
-      <w:bookmarkEnd w:id="18"/>
+      <w:bookmarkEnd w:id="26"/>
+      <w:bookmarkEnd w:id="27"/>
     </w:p>
     <w:sectPr>
       <w:type w:val="nextPage"/>

</xml_diff>

<commit_message>
Added new CHAIN UNIT TESTS to Chain_APIs.docx. Moved old CHAIN UNIT TESTS to chains.service.spec.old.ts.
</commit_message>
<xml_diff>
--- a/Portal_Database_Design/APIs/Chain_APIs.docx
+++ b/Portal_Database_Design/APIs/Chain_APIs.docx
@@ -16,18 +16,18 @@
         </w:tblCellMar>
       </w:tblPr>
       <w:tblGrid>
-        <w:gridCol w:w="1596"/>
-        <w:gridCol w:w="1616"/>
+        <w:gridCol w:w="1595"/>
+        <w:gridCol w:w="1617"/>
         <w:gridCol w:w="1601"/>
         <w:gridCol w:w="1612"/>
-        <w:gridCol w:w="1607"/>
-        <w:gridCol w:w="1605"/>
+        <w:gridCol w:w="1608"/>
+        <w:gridCol w:w="1604"/>
       </w:tblGrid>
       <w:tr>
         <w:trPr/>
         <w:tc>
           <w:tcPr>
-            <w:tcW w:w="1596" w:type="dxa"/>
+            <w:tcW w:w="1595" w:type="dxa"/>
             <w:tcBorders>
               <w:top w:val="single" w:sz="4" w:space="0" w:color="000000"/>
               <w:start w:val="single" w:sz="4" w:space="0" w:color="000000"/>
@@ -77,7 +77,7 @@
         </w:tc>
         <w:tc>
           <w:tcPr>
-            <w:tcW w:w="1616" w:type="dxa"/>
+            <w:tcW w:w="1617" w:type="dxa"/>
             <w:tcBorders>
               <w:top w:val="single" w:sz="4" w:space="0" w:color="000000"/>
               <w:start w:val="single" w:sz="4" w:space="0" w:color="000000"/>
@@ -227,7 +227,7 @@
         </w:tc>
         <w:tc>
           <w:tcPr>
-            <w:tcW w:w="1607" w:type="dxa"/>
+            <w:tcW w:w="1608" w:type="dxa"/>
             <w:tcBorders>
               <w:top w:val="single" w:sz="4" w:space="0" w:color="000000"/>
               <w:start w:val="single" w:sz="4" w:space="0" w:color="000000"/>
@@ -277,7 +277,7 @@
         </w:tc>
         <w:tc>
           <w:tcPr>
-            <w:tcW w:w="1605" w:type="dxa"/>
+            <w:tcW w:w="1604" w:type="dxa"/>
             <w:tcBorders>
               <w:top w:val="single" w:sz="4" w:space="0" w:color="000000"/>
               <w:start w:val="single" w:sz="4" w:space="0" w:color="000000"/>
@@ -331,7 +331,7 @@
         <w:trPr/>
         <w:tc>
           <w:tcPr>
-            <w:tcW w:w="1596" w:type="dxa"/>
+            <w:tcW w:w="1595" w:type="dxa"/>
             <w:tcBorders>
               <w:start w:val="single" w:sz="4" w:space="0" w:color="000000"/>
               <w:bottom w:val="single" w:sz="4" w:space="0" w:color="000000"/>
@@ -380,7 +380,7 @@
         </w:tc>
         <w:tc>
           <w:tcPr>
-            <w:tcW w:w="1616" w:type="dxa"/>
+            <w:tcW w:w="1617" w:type="dxa"/>
             <w:tcBorders>
               <w:start w:val="single" w:sz="4" w:space="0" w:color="000000"/>
               <w:bottom w:val="single" w:sz="4" w:space="0" w:color="000000"/>
@@ -527,7 +527,7 @@
         </w:tc>
         <w:tc>
           <w:tcPr>
-            <w:tcW w:w="1607" w:type="dxa"/>
+            <w:tcW w:w="1608" w:type="dxa"/>
             <w:tcBorders>
               <w:start w:val="single" w:sz="4" w:space="0" w:color="000000"/>
               <w:bottom w:val="single" w:sz="4" w:space="0" w:color="000000"/>
@@ -576,7 +576,7 @@
         </w:tc>
         <w:tc>
           <w:tcPr>
-            <w:tcW w:w="1605" w:type="dxa"/>
+            <w:tcW w:w="1604" w:type="dxa"/>
             <w:tcBorders>
               <w:start w:val="single" w:sz="4" w:space="0" w:color="000000"/>
               <w:bottom w:val="single" w:sz="4" w:space="0" w:color="000000"/>
@@ -648,7 +648,7 @@
         <w:trPr/>
         <w:tc>
           <w:tcPr>
-            <w:tcW w:w="1596" w:type="dxa"/>
+            <w:tcW w:w="1595" w:type="dxa"/>
             <w:tcBorders>
               <w:start w:val="single" w:sz="4" w:space="0" w:color="000000"/>
               <w:bottom w:val="single" w:sz="4" w:space="0" w:color="000000"/>
@@ -697,7 +697,7 @@
         </w:tc>
         <w:tc>
           <w:tcPr>
-            <w:tcW w:w="1616" w:type="dxa"/>
+            <w:tcW w:w="1617" w:type="dxa"/>
             <w:tcBorders>
               <w:start w:val="single" w:sz="4" w:space="0" w:color="000000"/>
               <w:bottom w:val="single" w:sz="4" w:space="0" w:color="000000"/>
@@ -844,7 +844,7 @@
         </w:tc>
         <w:tc>
           <w:tcPr>
-            <w:tcW w:w="1607" w:type="dxa"/>
+            <w:tcW w:w="1608" w:type="dxa"/>
             <w:tcBorders>
               <w:start w:val="single" w:sz="4" w:space="0" w:color="000000"/>
               <w:bottom w:val="single" w:sz="4" w:space="0" w:color="000000"/>
@@ -893,7 +893,7 @@
         </w:tc>
         <w:tc>
           <w:tcPr>
-            <w:tcW w:w="1605" w:type="dxa"/>
+            <w:tcW w:w="1604" w:type="dxa"/>
             <w:tcBorders>
               <w:start w:val="single" w:sz="4" w:space="0" w:color="000000"/>
               <w:bottom w:val="single" w:sz="4" w:space="0" w:color="000000"/>
@@ -965,7 +965,7 @@
         <w:trPr/>
         <w:tc>
           <w:tcPr>
-            <w:tcW w:w="1596" w:type="dxa"/>
+            <w:tcW w:w="1595" w:type="dxa"/>
             <w:tcBorders>
               <w:start w:val="single" w:sz="4" w:space="0" w:color="000000"/>
               <w:bottom w:val="single" w:sz="4" w:space="0" w:color="000000"/>
@@ -1014,7 +1014,7 @@
         </w:tc>
         <w:tc>
           <w:tcPr>
-            <w:tcW w:w="1616" w:type="dxa"/>
+            <w:tcW w:w="1617" w:type="dxa"/>
             <w:tcBorders>
               <w:start w:val="single" w:sz="4" w:space="0" w:color="000000"/>
               <w:bottom w:val="single" w:sz="4" w:space="0" w:color="000000"/>
@@ -1161,7 +1161,7 @@
         </w:tc>
         <w:tc>
           <w:tcPr>
-            <w:tcW w:w="1607" w:type="dxa"/>
+            <w:tcW w:w="1608" w:type="dxa"/>
             <w:tcBorders>
               <w:start w:val="single" w:sz="4" w:space="0" w:color="000000"/>
               <w:bottom w:val="single" w:sz="4" w:space="0" w:color="000000"/>
@@ -1210,7 +1210,7 @@
         </w:tc>
         <w:tc>
           <w:tcPr>
-            <w:tcW w:w="1605" w:type="dxa"/>
+            <w:tcW w:w="1604" w:type="dxa"/>
             <w:tcBorders>
               <w:start w:val="single" w:sz="4" w:space="0" w:color="000000"/>
               <w:bottom w:val="single" w:sz="4" w:space="0" w:color="000000"/>
@@ -1282,7 +1282,7 @@
         <w:trPr/>
         <w:tc>
           <w:tcPr>
-            <w:tcW w:w="1596" w:type="dxa"/>
+            <w:tcW w:w="1595" w:type="dxa"/>
             <w:tcBorders>
               <w:start w:val="single" w:sz="4" w:space="0" w:color="000000"/>
               <w:bottom w:val="single" w:sz="4" w:space="0" w:color="000000"/>
@@ -1331,7 +1331,7 @@
         </w:tc>
         <w:tc>
           <w:tcPr>
-            <w:tcW w:w="1616" w:type="dxa"/>
+            <w:tcW w:w="1617" w:type="dxa"/>
             <w:tcBorders>
               <w:start w:val="single" w:sz="4" w:space="0" w:color="000000"/>
               <w:bottom w:val="single" w:sz="4" w:space="0" w:color="000000"/>
@@ -1478,7 +1478,7 @@
         </w:tc>
         <w:tc>
           <w:tcPr>
-            <w:tcW w:w="1607" w:type="dxa"/>
+            <w:tcW w:w="1608" w:type="dxa"/>
             <w:tcBorders>
               <w:start w:val="single" w:sz="4" w:space="0" w:color="000000"/>
               <w:bottom w:val="single" w:sz="4" w:space="0" w:color="000000"/>
@@ -1527,7 +1527,7 @@
         </w:tc>
         <w:tc>
           <w:tcPr>
-            <w:tcW w:w="1605" w:type="dxa"/>
+            <w:tcW w:w="1604" w:type="dxa"/>
             <w:tcBorders>
               <w:start w:val="single" w:sz="4" w:space="0" w:color="000000"/>
               <w:bottom w:val="single" w:sz="4" w:space="0" w:color="000000"/>
@@ -1582,7 +1582,7 @@
         </w:trPr>
         <w:tc>
           <w:tcPr>
-            <w:tcW w:w="1596" w:type="dxa"/>
+            <w:tcW w:w="1595" w:type="dxa"/>
             <w:tcBorders>
               <w:start w:val="single" w:sz="4" w:space="0" w:color="000000"/>
               <w:bottom w:val="single" w:sz="4" w:space="0" w:color="000000"/>
@@ -1631,7 +1631,7 @@
         </w:tc>
         <w:tc>
           <w:tcPr>
-            <w:tcW w:w="1616" w:type="dxa"/>
+            <w:tcW w:w="1617" w:type="dxa"/>
             <w:tcBorders>
               <w:start w:val="single" w:sz="4" w:space="0" w:color="000000"/>
               <w:bottom w:val="single" w:sz="4" w:space="0" w:color="000000"/>
@@ -1778,7 +1778,7 @@
         </w:tc>
         <w:tc>
           <w:tcPr>
-            <w:tcW w:w="1607" w:type="dxa"/>
+            <w:tcW w:w="1608" w:type="dxa"/>
             <w:tcBorders>
               <w:start w:val="single" w:sz="4" w:space="0" w:color="000000"/>
               <w:bottom w:val="single" w:sz="4" w:space="0" w:color="000000"/>
@@ -1827,7 +1827,7 @@
         </w:tc>
         <w:tc>
           <w:tcPr>
-            <w:tcW w:w="1605" w:type="dxa"/>
+            <w:tcW w:w="1604" w:type="dxa"/>
             <w:tcBorders>
               <w:start w:val="single" w:sz="4" w:space="0" w:color="000000"/>
               <w:bottom w:val="single" w:sz="4" w:space="0" w:color="000000"/>
@@ -1882,7 +1882,7 @@
         <w:trPr/>
         <w:tc>
           <w:tcPr>
-            <w:tcW w:w="1596" w:type="dxa"/>
+            <w:tcW w:w="1595" w:type="dxa"/>
             <w:tcBorders>
               <w:start w:val="single" w:sz="4" w:space="0" w:color="000000"/>
               <w:bottom w:val="single" w:sz="4" w:space="0" w:color="000000"/>
@@ -1931,7 +1931,7 @@
         </w:tc>
         <w:tc>
           <w:tcPr>
-            <w:tcW w:w="1616" w:type="dxa"/>
+            <w:tcW w:w="1617" w:type="dxa"/>
             <w:tcBorders>
               <w:start w:val="single" w:sz="4" w:space="0" w:color="000000"/>
               <w:bottom w:val="single" w:sz="4" w:space="0" w:color="000000"/>
@@ -2078,7 +2078,7 @@
         </w:tc>
         <w:tc>
           <w:tcPr>
-            <w:tcW w:w="1607" w:type="dxa"/>
+            <w:tcW w:w="1608" w:type="dxa"/>
             <w:tcBorders>
               <w:start w:val="single" w:sz="4" w:space="0" w:color="000000"/>
               <w:bottom w:val="single" w:sz="4" w:space="0" w:color="000000"/>
@@ -2127,7 +2127,7 @@
         </w:tc>
         <w:tc>
           <w:tcPr>
-            <w:tcW w:w="1605" w:type="dxa"/>
+            <w:tcW w:w="1604" w:type="dxa"/>
             <w:tcBorders>
               <w:start w:val="single" w:sz="4" w:space="0" w:color="000000"/>
               <w:bottom w:val="single" w:sz="4" w:space="0" w:color="000000"/>
@@ -2156,8 +2156,8 @@
                 <w:u w:val="none"/>
               </w:rPr>
             </w:pPr>
-            <w:bookmarkStart w:id="4" w:name="__DdeLink__202_1060888073"/>
-            <w:bookmarkStart w:id="5" w:name="__DdeLink__199_1060888073"/>
+            <w:bookmarkStart w:id="4" w:name="__DdeLink__199_1060888073"/>
+            <w:bookmarkStart w:id="5" w:name="__DdeLink__202_1060888073"/>
             <w:r>
               <w:rPr>
                 <w:b w:val="false"/>
@@ -2184,7 +2184,7 @@
         <w:trPr/>
         <w:tc>
           <w:tcPr>
-            <w:tcW w:w="1596" w:type="dxa"/>
+            <w:tcW w:w="1595" w:type="dxa"/>
             <w:tcBorders>
               <w:start w:val="single" w:sz="4" w:space="0" w:color="000000"/>
               <w:bottom w:val="single" w:sz="4" w:space="0" w:color="000000"/>
@@ -2233,7 +2233,7 @@
         </w:tc>
         <w:tc>
           <w:tcPr>
-            <w:tcW w:w="1616" w:type="dxa"/>
+            <w:tcW w:w="1617" w:type="dxa"/>
             <w:tcBorders>
               <w:start w:val="single" w:sz="4" w:space="0" w:color="000000"/>
               <w:bottom w:val="single" w:sz="4" w:space="0" w:color="000000"/>
@@ -2380,7 +2380,7 @@
         </w:tc>
         <w:tc>
           <w:tcPr>
-            <w:tcW w:w="1607" w:type="dxa"/>
+            <w:tcW w:w="1608" w:type="dxa"/>
             <w:tcBorders>
               <w:start w:val="single" w:sz="4" w:space="0" w:color="000000"/>
               <w:bottom w:val="single" w:sz="4" w:space="0" w:color="000000"/>
@@ -2429,7 +2429,7 @@
         </w:tc>
         <w:tc>
           <w:tcPr>
-            <w:tcW w:w="1605" w:type="dxa"/>
+            <w:tcW w:w="1604" w:type="dxa"/>
             <w:tcBorders>
               <w:start w:val="single" w:sz="4" w:space="0" w:color="000000"/>
               <w:bottom w:val="single" w:sz="4" w:space="0" w:color="000000"/>
@@ -2518,10 +2518,9 @@
           <w:bCs w:val="false"/>
         </w:rPr>
       </w:pPr>
-      <w:bookmarkStart w:id="6" w:name="__DdeLink__264_761320732"/>
+      <w:bookmarkStart w:id="6" w:name="__DdeLink__261_1626357650"/>
       <w:bookmarkStart w:id="7" w:name="__DdeLink__251_1626357650"/>
-      <w:bookmarkStart w:id="8" w:name="__DdeLink__261_1626357650"/>
-      <w:bookmarkStart w:id="9" w:name="__DdeLink__240_1626357650"/>
+      <w:bookmarkStart w:id="8" w:name="__DdeLink__264_761320732"/>
       <w:r>
         <w:rPr>
           <w:b w:val="false"/>
@@ -2564,7 +2563,7 @@
         </w:rPr>
         <w:t xml:space="preserve">updateChainName -&gt; Takes the chain_name from the DTO, the chain_id from the URL param, both from the front-end and updates the chain_name of the respective CHAIN record. </w:t>
       </w:r>
-      <w:bookmarkStart w:id="10" w:name="__DdeLink__229_1626357650"/>
+      <w:bookmarkStart w:id="9" w:name="__DdeLink__229_1626357650"/>
       <w:r>
         <w:rPr>
           <w:b w:val="false"/>
@@ -2572,16 +2571,67 @@
         </w:rPr>
         <w:t xml:space="preserve">This can only be done by a company_manager or a chain_manager. If it is being done by a chain_manager, then that chain_manager must belong to an outlet of the chain which is having its name updated. </w:t>
       </w:r>
-      <w:bookmarkStart w:id="11" w:name="__DdeLink__242_1626357650"/>
+      <w:bookmarkStart w:id="10" w:name="__DdeLink__242_1626357650"/>
+      <w:bookmarkEnd w:id="9"/>
+      <w:r>
+        <w:rPr>
+          <w:b w:val="false"/>
+          <w:bCs w:val="false"/>
+        </w:rPr>
+        <w:t>Note that a join between OUTLETS, CHAINS and USERS would have to be done to get the chain to which the chain_manager belongs.</w:t>
+      </w:r>
       <w:bookmarkEnd w:id="10"/>
-      <w:r>
-        <w:rPr>
-          <w:b w:val="false"/>
-          <w:bCs w:val="false"/>
-        </w:rPr>
-        <w:t>Note that a join between OUTLETS, CHAINS and USERS would have to be done to get the chain to which the chain_manager belongs.</w:t>
+    </w:p>
+    <w:p>
+      <w:pPr>
+        <w:pStyle w:val="Normal"/>
+        <w:bidi w:val="0"/>
+        <w:jc w:val="both"/>
+        <w:rPr>
+          <w:b w:val="false"/>
+          <w:bCs w:val="false"/>
+        </w:rPr>
+      </w:pPr>
+      <w:r>
+        <w:rPr>
+          <w:b w:val="false"/>
+          <w:bCs w:val="false"/>
+        </w:rPr>
+      </w:r>
+    </w:p>
+    <w:p>
+      <w:pPr>
+        <w:pStyle w:val="Normal"/>
+        <w:bidi w:val="0"/>
+        <w:jc w:val="both"/>
+        <w:rPr>
+          <w:b w:val="false"/>
+          <w:bCs w:val="false"/>
+        </w:rPr>
+      </w:pPr>
+      <w:r>
+        <w:rPr>
+          <w:b w:val="false"/>
+          <w:bCs w:val="false"/>
+        </w:rPr>
+        <w:t xml:space="preserve">updateChainAddress -&gt; Takes the chain_address_* related fields from the DTO, the chain_id from the URL param from the front-end and updates the chain_address_* related fields of the respective CHAIN record. </w:t>
+      </w:r>
+      <w:bookmarkStart w:id="11" w:name="__DdeLink__233_1626357650"/>
+      <w:r>
+        <w:rPr>
+          <w:b w:val="false"/>
+          <w:bCs w:val="false"/>
+        </w:rPr>
+        <w:t xml:space="preserve">This can only be done by a company_manager or a chain_manager. </w:t>
       </w:r>
       <w:bookmarkEnd w:id="11"/>
+      <w:r>
+        <w:rPr>
+          <w:b w:val="false"/>
+          <w:bCs w:val="false"/>
+        </w:rPr>
+        <w:t>If it is being done by a chain_manager, then that chain_manager must belong to an outlet of the chain which is having its chain_address_* field updated. Note that a join between OUTLETS, CHAINS and USERS would have to be done to get the chain to which the chain_manager belongs.</w:t>
+      </w:r>
     </w:p>
     <w:p>
       <w:pPr>
@@ -2610,20 +2660,29 @@
           <w:bCs w:val="false"/>
         </w:rPr>
       </w:pPr>
-      <w:r>
-        <w:rPr>
-          <w:b w:val="false"/>
-          <w:bCs w:val="false"/>
-        </w:rPr>
-        <w:t xml:space="preserve">updateChainAddress -&gt; Takes the chain_address_* related fields from the DTO, the chain_id from the URL param from the front-end and updates the chain_address_* related fields of the respective CHAIN record. </w:t>
-      </w:r>
-      <w:bookmarkStart w:id="12" w:name="__DdeLink__233_1626357650"/>
-      <w:r>
-        <w:rPr>
-          <w:b w:val="false"/>
-          <w:bCs w:val="false"/>
-        </w:rPr>
-        <w:t xml:space="preserve">This can only be done by a company_manager or a chain_manager. </w:t>
+      <w:bookmarkStart w:id="12" w:name="__DdeLink__149_588342144"/>
+      <w:r>
+        <w:rPr>
+          <w:b w:val="false"/>
+          <w:bCs w:val="false"/>
+        </w:rPr>
+        <w:t xml:space="preserve">findOneChain -&gt; Takes the </w:t>
+      </w:r>
+      <w:bookmarkStart w:id="13" w:name="__DdeLink__443_1184157458"/>
+      <w:r>
+        <w:rPr>
+          <w:b w:val="false"/>
+          <w:bCs w:val="false"/>
+        </w:rPr>
+        <w:t>chain_id from the URL parameter from the front-end</w:t>
+      </w:r>
+      <w:bookmarkEnd w:id="13"/>
+      <w:r>
+        <w:rPr>
+          <w:b w:val="false"/>
+          <w:bCs w:val="false"/>
+        </w:rPr>
+        <w:t xml:space="preserve"> and returns the respective CHAIN record.</w:t>
       </w:r>
       <w:bookmarkEnd w:id="12"/>
       <w:r>
@@ -2631,8 +2690,17 @@
           <w:b w:val="false"/>
           <w:bCs w:val="false"/>
         </w:rPr>
-        <w:t>If it is being done by a chain_manager, then that chain_manager must belong to an outlet of the chain which is having its chain_address_* field updated. Note that a join between OUTLETS, CHAINS and USERS would have to be done to get the chain to which the chain_manager belongs.</w:t>
-      </w:r>
+        <w:t xml:space="preserve"> </w:t>
+      </w:r>
+      <w:bookmarkStart w:id="14" w:name="__DdeLink__231_1626357650"/>
+      <w:r>
+        <w:rPr>
+          <w:b w:val="false"/>
+          <w:bCs w:val="false"/>
+        </w:rPr>
+        <w:t>Users of all user_roles can use findOneChain.</w:t>
+      </w:r>
+      <w:bookmarkEnd w:id="14"/>
     </w:p>
     <w:p>
       <w:pPr>
@@ -2661,119 +2729,50 @@
           <w:bCs w:val="false"/>
         </w:rPr>
       </w:pPr>
-      <w:bookmarkStart w:id="13" w:name="__DdeLink__149_588342144"/>
-      <w:r>
-        <w:rPr>
-          <w:b w:val="false"/>
-          <w:bCs w:val="false"/>
-        </w:rPr>
-        <w:t xml:space="preserve">findOneChain -&gt; Takes the </w:t>
-      </w:r>
-      <w:bookmarkStart w:id="14" w:name="__DdeLink__443_1184157458"/>
-      <w:r>
-        <w:rPr>
-          <w:b w:val="false"/>
-          <w:bCs w:val="false"/>
-        </w:rPr>
-        <w:t>chain_id from the URL parameter from the front-end</w:t>
-      </w:r>
-      <w:bookmarkEnd w:id="14"/>
-      <w:r>
-        <w:rPr>
-          <w:b w:val="false"/>
-          <w:bCs w:val="false"/>
-        </w:rPr>
-        <w:t xml:space="preserve"> and returns the respective CHAIN record.</w:t>
-      </w:r>
-      <w:bookmarkEnd w:id="13"/>
-      <w:r>
-        <w:rPr>
-          <w:b w:val="false"/>
-          <w:bCs w:val="false"/>
-        </w:rPr>
-        <w:t xml:space="preserve"> </w:t>
-      </w:r>
-      <w:bookmarkStart w:id="15" w:name="__DdeLink__231_1626357650"/>
-      <w:r>
-        <w:rPr>
-          <w:b w:val="false"/>
-          <w:bCs w:val="false"/>
-        </w:rPr>
-        <w:t>Users of all user_roles can use findOneChain.</w:t>
+      <w:r>
+        <w:rPr>
+          <w:b w:val="false"/>
+          <w:bCs w:val="false"/>
+        </w:rPr>
+        <w:t>findAllChains -&gt; Takes no input from the front-end and returns all CHAIN records. Users of all user_roles can use findAllChains.</w:t>
+      </w:r>
+    </w:p>
+    <w:p>
+      <w:pPr>
+        <w:pStyle w:val="Normal"/>
+        <w:bidi w:val="0"/>
+        <w:jc w:val="both"/>
+        <w:rPr>
+          <w:b w:val="false"/>
+          <w:bCs w:val="false"/>
+        </w:rPr>
+      </w:pPr>
+      <w:r>
+        <w:rPr>
+          <w:b w:val="false"/>
+          <w:bCs w:val="false"/>
+        </w:rPr>
+      </w:r>
+    </w:p>
+    <w:p>
+      <w:pPr>
+        <w:pStyle w:val="Normal"/>
+        <w:bidi w:val="0"/>
+        <w:jc w:val="both"/>
+        <w:rPr>
+          <w:b w:val="false"/>
+          <w:bCs w:val="false"/>
+        </w:rPr>
+      </w:pPr>
+      <w:bookmarkStart w:id="15" w:name="__DdeLink__240_1626357650"/>
+      <w:r>
+        <w:rPr>
+          <w:b w:val="false"/>
+          <w:bCs w:val="false"/>
+        </w:rPr>
+        <w:t>removeChain  -&gt; Takes the chain_id from the URL parameter from the front-end, deletes the respective CHAIN record and returns the deleted CHAIN record. This can only be done by a company_manager or a chain_manager. If it is done by a chain_manager, then that chain_manager must belong to an outlet of the chain which is being removed.</w:t>
       </w:r>
       <w:bookmarkEnd w:id="15"/>
-    </w:p>
-    <w:p>
-      <w:pPr>
-        <w:pStyle w:val="Normal"/>
-        <w:bidi w:val="0"/>
-        <w:jc w:val="both"/>
-        <w:rPr>
-          <w:b w:val="false"/>
-          <w:bCs w:val="false"/>
-        </w:rPr>
-      </w:pPr>
-      <w:r>
-        <w:rPr>
-          <w:b w:val="false"/>
-          <w:bCs w:val="false"/>
-        </w:rPr>
-      </w:r>
-    </w:p>
-    <w:p>
-      <w:pPr>
-        <w:pStyle w:val="Normal"/>
-        <w:bidi w:val="0"/>
-        <w:jc w:val="both"/>
-        <w:rPr>
-          <w:b w:val="false"/>
-          <w:bCs w:val="false"/>
-        </w:rPr>
-      </w:pPr>
-      <w:r>
-        <w:rPr>
-          <w:b w:val="false"/>
-          <w:bCs w:val="false"/>
-        </w:rPr>
-        <w:t>findAllChains -&gt; Takes no input from the front-end and returns all CHAIN records. Users of all user_roles can use findAllChains.</w:t>
-      </w:r>
-    </w:p>
-    <w:p>
-      <w:pPr>
-        <w:pStyle w:val="Normal"/>
-        <w:bidi w:val="0"/>
-        <w:jc w:val="both"/>
-        <w:rPr>
-          <w:b w:val="false"/>
-          <w:bCs w:val="false"/>
-        </w:rPr>
-      </w:pPr>
-      <w:r>
-        <w:rPr>
-          <w:b w:val="false"/>
-          <w:bCs w:val="false"/>
-        </w:rPr>
-      </w:r>
-    </w:p>
-    <w:p>
-      <w:pPr>
-        <w:pStyle w:val="Normal"/>
-        <w:bidi w:val="0"/>
-        <w:jc w:val="both"/>
-        <w:rPr>
-          <w:b w:val="false"/>
-          <w:bCs w:val="false"/>
-        </w:rPr>
-      </w:pPr>
-      <w:bookmarkStart w:id="16" w:name="__DdeLink__240_1626357650"/>
-      <w:r>
-        <w:rPr>
-          <w:b w:val="false"/>
-          <w:bCs w:val="false"/>
-        </w:rPr>
-        <w:t>removeChain  -&gt; Takes the chain_id from the URL parameter from the front-end, deletes the respective CHAIN record and returns the deleted CHAIN record. This can only be done by a company_manager or a chain_manager. If it is done by a chain_manager, then that chain_manager must belong to an outlet of the chain which is being removed.</w:t>
-      </w:r>
-      <w:bookmarkEnd w:id="16"/>
       <w:r>
         <w:rPr>
           <w:b w:val="false"/>
@@ -2946,11 +2945,119 @@
         <w:jc w:val="start"/>
         <w:rPr/>
       </w:pPr>
-      <w:bookmarkStart w:id="17" w:name="__DdeLink__92_3803631280"/>
+      <w:bookmarkStart w:id="16" w:name="__DdeLink__92_3803631280"/>
       <w:r>
         <w:rPr/>
         <w:t>* Create a CHAIN tuple without the chain_headquarters_address_city.</w:t>
       </w:r>
+      <w:bookmarkEnd w:id="16"/>
+    </w:p>
+    <w:p>
+      <w:pPr>
+        <w:pStyle w:val="Normal"/>
+        <w:bidi w:val="0"/>
+        <w:jc w:val="start"/>
+        <w:rPr/>
+      </w:pPr>
+      <w:r>
+        <w:rPr/>
+        <w:t>* Create a CHAIN tuple without the chain_headquarters_address_post_code.</w:t>
+      </w:r>
+    </w:p>
+    <w:p>
+      <w:pPr>
+        <w:pStyle w:val="Normal"/>
+        <w:bidi w:val="0"/>
+        <w:jc w:val="start"/>
+        <w:rPr/>
+      </w:pPr>
+      <w:r>
+        <w:rPr/>
+      </w:r>
+    </w:p>
+    <w:p>
+      <w:pPr>
+        <w:pStyle w:val="Normal"/>
+        <w:bidi w:val="0"/>
+        <w:jc w:val="start"/>
+        <w:rPr/>
+      </w:pPr>
+      <w:r>
+        <w:rPr/>
+        <w:t>For UpdateChainName, the following tests:</w:t>
+      </w:r>
+    </w:p>
+    <w:p>
+      <w:pPr>
+        <w:pStyle w:val="Normal"/>
+        <w:bidi w:val="0"/>
+        <w:jc w:val="start"/>
+        <w:rPr/>
+      </w:pPr>
+      <w:r>
+        <w:rPr/>
+        <w:t>* Send an empty request body.</w:t>
+      </w:r>
+    </w:p>
+    <w:p>
+      <w:pPr>
+        <w:pStyle w:val="Normal"/>
+        <w:bidi w:val="0"/>
+        <w:jc w:val="start"/>
+        <w:rPr/>
+      </w:pPr>
+      <w:r>
+        <w:rPr/>
+        <w:t>* Update a CHAIN’s chain_name with 1234.</w:t>
+      </w:r>
+    </w:p>
+    <w:p>
+      <w:pPr>
+        <w:pStyle w:val="Normal"/>
+        <w:bidi w:val="0"/>
+        <w:jc w:val="start"/>
+        <w:rPr/>
+      </w:pPr>
+      <w:r>
+        <w:rPr/>
+        <w:t>* Update a CHAIN’s chain_name with a name containing letters and numbers.</w:t>
+      </w:r>
+    </w:p>
+    <w:p>
+      <w:pPr>
+        <w:pStyle w:val="Normal"/>
+        <w:bidi w:val="0"/>
+        <w:jc w:val="start"/>
+        <w:rPr/>
+      </w:pPr>
+      <w:r>
+        <w:rPr/>
+        <w:t>* Update a CHAIN’s chain_name with a name containing letters only.</w:t>
+      </w:r>
+    </w:p>
+    <w:p>
+      <w:pPr>
+        <w:pStyle w:val="Normal"/>
+        <w:bidi w:val="0"/>
+        <w:jc w:val="start"/>
+        <w:rPr/>
+      </w:pPr>
+      <w:r>
+        <w:rPr/>
+      </w:r>
+    </w:p>
+    <w:p>
+      <w:pPr>
+        <w:pStyle w:val="Normal"/>
+        <w:bidi w:val="0"/>
+        <w:jc w:val="start"/>
+        <w:rPr/>
+      </w:pPr>
+      <w:bookmarkStart w:id="17" w:name="__DdeLink__100_3803631280"/>
+      <w:r>
+        <w:rPr/>
+        <w:t>For UpdateChainAddress, the following tests:</w:t>
+      </w:r>
       <w:bookmarkEnd w:id="17"/>
     </w:p>
     <w:p>
@@ -2962,7 +3069,7 @@
       </w:pPr>
       <w:r>
         <w:rPr/>
-        <w:t>* Create a CHAIN tuple without the chain_headquarters_address_post_code.</w:t>
+        <w:t>* Send an empty request body.</w:t>
       </w:r>
     </w:p>
     <w:p>
@@ -2972,9 +3079,12 @@
         <w:jc w:val="start"/>
         <w:rPr/>
       </w:pPr>
-      <w:r>
-        <w:rPr/>
-      </w:r>
+      <w:bookmarkStart w:id="18" w:name="__DdeLink__94_3803631280"/>
+      <w:r>
+        <w:rPr/>
+        <w:t>* Update the CHAIN’s chain_headquarters_address_city.</w:t>
+      </w:r>
+      <w:bookmarkEnd w:id="18"/>
     </w:p>
     <w:p>
       <w:pPr>
@@ -2985,7 +3095,17 @@
       </w:pPr>
       <w:r>
         <w:rPr/>
-        <w:t>For UpdateChainName, the following tests:</w:t>
+        <w:t xml:space="preserve">* </w:t>
+      </w:r>
+      <w:bookmarkStart w:id="19" w:name="__DdeLink__96_3803631280"/>
+      <w:r>
+        <w:rPr/>
+        <w:t>Update the CHAIN’s chain_headquarters_address_street</w:t>
+      </w:r>
+      <w:bookmarkEnd w:id="19"/>
+      <w:r>
+        <w:rPr/>
+        <w:t>.</w:t>
       </w:r>
     </w:p>
     <w:p>
@@ -2995,6 +3115,67 @@
         <w:jc w:val="start"/>
         <w:rPr/>
       </w:pPr>
+      <w:bookmarkStart w:id="20" w:name="__DdeLink__98_3803631280"/>
+      <w:r>
+        <w:rPr/>
+        <w:t>* Update the CHAIN’s chain_headquarters_address_country.</w:t>
+      </w:r>
+      <w:bookmarkEnd w:id="20"/>
+    </w:p>
+    <w:p>
+      <w:pPr>
+        <w:pStyle w:val="Normal"/>
+        <w:bidi w:val="0"/>
+        <w:jc w:val="start"/>
+        <w:rPr/>
+      </w:pPr>
+      <w:r>
+        <w:rPr/>
+        <w:t>* Update the CHAIN’s chain_headquarters_address_admin_division.</w:t>
+      </w:r>
+    </w:p>
+    <w:p>
+      <w:pPr>
+        <w:pStyle w:val="Normal"/>
+        <w:bidi w:val="0"/>
+        <w:jc w:val="start"/>
+        <w:rPr/>
+      </w:pPr>
+      <w:r>
+        <w:rPr/>
+        <w:t>* Update the CHAIN’s chain_headquarters_address_post_code.</w:t>
+      </w:r>
+    </w:p>
+    <w:p>
+      <w:pPr>
+        <w:pStyle w:val="Normal"/>
+        <w:bidi w:val="0"/>
+        <w:jc w:val="start"/>
+        <w:rPr/>
+      </w:pPr>
+      <w:r>
+        <w:rPr/>
+      </w:r>
+    </w:p>
+    <w:p>
+      <w:pPr>
+        <w:pStyle w:val="Normal"/>
+        <w:bidi w:val="0"/>
+        <w:jc w:val="start"/>
+        <w:rPr/>
+      </w:pPr>
+      <w:r>
+        <w:rPr/>
+        <w:t>For removeChain, the following tests:</w:t>
+      </w:r>
+    </w:p>
+    <w:p>
+      <w:pPr>
+        <w:pStyle w:val="Normal"/>
+        <w:bidi w:val="0"/>
+        <w:jc w:val="start"/>
+        <w:rPr/>
+      </w:pPr>
       <w:r>
         <w:rPr/>
         <w:t>* Send an empty request body.</w:t>
@@ -3009,7 +3190,7 @@
       </w:pPr>
       <w:r>
         <w:rPr/>
-        <w:t>* Update a CHAIN’s chain_name with 1234.</w:t>
+        <w:t>* Delete the CHAIN with chain_id 11.</w:t>
       </w:r>
     </w:p>
     <w:p>
@@ -3019,198 +3200,16 @@
         <w:jc w:val="start"/>
         <w:rPr/>
       </w:pPr>
-      <w:r>
-        <w:rPr/>
-        <w:t>* Update a CHAIN’s chain_name with a name containing letters and numbers.</w:t>
-      </w:r>
-    </w:p>
-    <w:p>
-      <w:pPr>
-        <w:pStyle w:val="Normal"/>
-        <w:bidi w:val="0"/>
-        <w:jc w:val="start"/>
-        <w:rPr/>
-      </w:pPr>
-      <w:r>
-        <w:rPr/>
-        <w:t>* Update a CHAIN’s chain_name with a name containing letters only.</w:t>
-      </w:r>
-    </w:p>
-    <w:p>
-      <w:pPr>
-        <w:pStyle w:val="Normal"/>
-        <w:bidi w:val="0"/>
-        <w:jc w:val="start"/>
-        <w:rPr/>
-      </w:pPr>
-      <w:r>
-        <w:rPr/>
-      </w:r>
-    </w:p>
-    <w:p>
-      <w:pPr>
-        <w:pStyle w:val="Normal"/>
-        <w:bidi w:val="0"/>
-        <w:jc w:val="start"/>
-        <w:rPr/>
-      </w:pPr>
-      <w:bookmarkStart w:id="18" w:name="__DdeLink__100_3803631280"/>
-      <w:r>
-        <w:rPr/>
-        <w:t>For UpdateChainAddress, the following tests:</w:t>
-      </w:r>
-      <w:bookmarkEnd w:id="18"/>
-    </w:p>
-    <w:p>
-      <w:pPr>
-        <w:pStyle w:val="Normal"/>
-        <w:bidi w:val="0"/>
-        <w:jc w:val="start"/>
-        <w:rPr/>
-      </w:pPr>
-      <w:r>
-        <w:rPr/>
-        <w:t>* Send an empty request body.</w:t>
-      </w:r>
-    </w:p>
-    <w:p>
-      <w:pPr>
-        <w:pStyle w:val="Normal"/>
-        <w:bidi w:val="0"/>
-        <w:jc w:val="start"/>
-        <w:rPr/>
-      </w:pPr>
-      <w:bookmarkStart w:id="19" w:name="__DdeLink__94_3803631280"/>
-      <w:r>
-        <w:rPr/>
-        <w:t>* Update the CHAIN’s chain_headquarters_address_city.</w:t>
-      </w:r>
-      <w:bookmarkEnd w:id="19"/>
-    </w:p>
-    <w:p>
-      <w:pPr>
-        <w:pStyle w:val="Normal"/>
-        <w:bidi w:val="0"/>
-        <w:jc w:val="start"/>
-        <w:rPr/>
-      </w:pPr>
-      <w:r>
-        <w:rPr/>
-        <w:t xml:space="preserve">* </w:t>
-      </w:r>
-      <w:bookmarkStart w:id="20" w:name="__DdeLink__96_3803631280"/>
-      <w:r>
-        <w:rPr/>
-        <w:t>Update the CHAIN’s chain_headquarters_address_street</w:t>
-      </w:r>
-      <w:bookmarkEnd w:id="20"/>
-      <w:r>
-        <w:rPr/>
-        <w:t>.</w:t>
-      </w:r>
-    </w:p>
-    <w:p>
-      <w:pPr>
-        <w:pStyle w:val="Normal"/>
-        <w:bidi w:val="0"/>
-        <w:jc w:val="start"/>
-        <w:rPr/>
-      </w:pPr>
-      <w:bookmarkStart w:id="21" w:name="__DdeLink__98_3803631280"/>
-      <w:r>
-        <w:rPr/>
-        <w:t>* Update the CHAIN’s chain_headquarters_address_country.</w:t>
+      <w:bookmarkStart w:id="21" w:name="__DdeLink__296_1992960000"/>
+      <w:bookmarkStart w:id="22" w:name="__DdeLink__142_2312781727"/>
+      <w:bookmarkStart w:id="23" w:name="__DdeLink__139_2312781727"/>
+      <w:r>
+        <w:rPr/>
+        <w:t>* Delete the CHAIN with chain_id 12.</w:t>
       </w:r>
       <w:bookmarkEnd w:id="21"/>
-    </w:p>
-    <w:p>
-      <w:pPr>
-        <w:pStyle w:val="Normal"/>
-        <w:bidi w:val="0"/>
-        <w:jc w:val="start"/>
-        <w:rPr/>
-      </w:pPr>
-      <w:r>
-        <w:rPr/>
-        <w:t>* Update the CHAIN’s chain_headquarters_address_admin_division.</w:t>
-      </w:r>
-    </w:p>
-    <w:p>
-      <w:pPr>
-        <w:pStyle w:val="Normal"/>
-        <w:bidi w:val="0"/>
-        <w:jc w:val="start"/>
-        <w:rPr/>
-      </w:pPr>
-      <w:r>
-        <w:rPr/>
-        <w:t>* Update the CHAIN’s chain_headquarters_address_post_code.</w:t>
-      </w:r>
-    </w:p>
-    <w:p>
-      <w:pPr>
-        <w:pStyle w:val="Normal"/>
-        <w:bidi w:val="0"/>
-        <w:jc w:val="start"/>
-        <w:rPr/>
-      </w:pPr>
-      <w:r>
-        <w:rPr/>
-      </w:r>
-    </w:p>
-    <w:p>
-      <w:pPr>
-        <w:pStyle w:val="Normal"/>
-        <w:bidi w:val="0"/>
-        <w:jc w:val="start"/>
-        <w:rPr/>
-      </w:pPr>
-      <w:r>
-        <w:rPr/>
-        <w:t>For removeChain, the following tests:</w:t>
-      </w:r>
-    </w:p>
-    <w:p>
-      <w:pPr>
-        <w:pStyle w:val="Normal"/>
-        <w:bidi w:val="0"/>
-        <w:jc w:val="start"/>
-        <w:rPr/>
-      </w:pPr>
-      <w:r>
-        <w:rPr/>
-        <w:t>* Send an empty request body.</w:t>
-      </w:r>
-    </w:p>
-    <w:p>
-      <w:pPr>
-        <w:pStyle w:val="Normal"/>
-        <w:bidi w:val="0"/>
-        <w:jc w:val="start"/>
-        <w:rPr/>
-      </w:pPr>
-      <w:r>
-        <w:rPr/>
-        <w:t>* Delete the CHAIN with chain_id 11.</w:t>
-      </w:r>
-    </w:p>
-    <w:p>
-      <w:pPr>
-        <w:pStyle w:val="Normal"/>
-        <w:bidi w:val="0"/>
-        <w:jc w:val="start"/>
-        <w:rPr/>
-      </w:pPr>
-      <w:bookmarkStart w:id="22" w:name="__DdeLink__139_2312781727"/>
-      <w:bookmarkStart w:id="23" w:name="__DdeLink__142_2312781727"/>
-      <w:bookmarkStart w:id="24" w:name="__DdeLink__296_1992960000"/>
-      <w:r>
-        <w:rPr/>
-        <w:t>* Delete the CHAIN with chain_id 12.</w:t>
-      </w:r>
       <w:bookmarkEnd w:id="22"/>
       <w:bookmarkEnd w:id="23"/>
-      <w:bookmarkEnd w:id="24"/>
     </w:p>
     <w:p>
       <w:pPr>
@@ -3259,12 +3258,88 @@
         <w:jc w:val="start"/>
         <w:rPr/>
       </w:pPr>
-      <w:bookmarkStart w:id="25" w:name="__DdeLink__138_2894387740"/>
+      <w:bookmarkStart w:id="24" w:name="__DdeLink__138_2894387740"/>
       <w:r>
         <w:rPr/>
         <w:t>* Add another CHAIN named “Test Chain” with the following details (chain_date_created_at, chain_headquarters_address_room_no, chain_headquarters_address_building, chain_headquarters_address_street, chain_headquarters_address_city, chain_headquarters_address_admin_division, chain_headquarters_address_country, chain_headquarters_address_post_code) (Test Chain', '14, 'Test Building 2', 'Test Street 2', 'Test City Two', 'Test Division Twoo', 'India', '560001)</w:t>
       </w:r>
+      <w:bookmarkEnd w:id="24"/>
+    </w:p>
+    <w:p>
+      <w:pPr>
+        <w:pStyle w:val="Normal"/>
+        <w:bidi w:val="0"/>
+        <w:jc w:val="start"/>
+        <w:rPr/>
+      </w:pPr>
+      <w:r>
+        <w:rPr/>
+        <w:t>* Change the chain_headquarters_address_room_no of “Test Chain” to NULL.</w:t>
+      </w:r>
+    </w:p>
+    <w:p>
+      <w:pPr>
+        <w:pStyle w:val="Normal"/>
+        <w:bidi w:val="0"/>
+        <w:jc w:val="start"/>
+        <w:rPr/>
+      </w:pPr>
+      <w:r>
+        <w:rPr/>
+        <w:t>* Change the chain_headquarters_address_room_no from NULL to “16”.</w:t>
+      </w:r>
+    </w:p>
+    <w:p>
+      <w:pPr>
+        <w:pStyle w:val="Normal"/>
+        <w:bidi w:val="0"/>
+        <w:jc w:val="start"/>
+        <w:rPr/>
+      </w:pPr>
+      <w:r>
+        <w:rPr/>
+        <w:t>* Change the chain_headquarters_address_building of “Test Chain” to NULL.</w:t>
+      </w:r>
+    </w:p>
+    <w:p>
+      <w:pPr>
+        <w:pStyle w:val="Normal"/>
+        <w:bidi w:val="0"/>
+        <w:jc w:val="start"/>
+        <w:rPr/>
+      </w:pPr>
+      <w:r>
+        <w:rPr/>
+        <w:t>* Change the chain_headquarters_address_building of “Test Chain” from NULL to “TEST BUILDING”.</w:t>
+      </w:r>
+    </w:p>
+    <w:p>
+      <w:pPr>
+        <w:pStyle w:val="Normal"/>
+        <w:bidi w:val="0"/>
+        <w:jc w:val="start"/>
+        <w:rPr/>
+      </w:pPr>
+      <w:r>
+        <w:rPr/>
+        <w:t>* Delete the CHAIN that has chain_id = 3.</w:t>
+      </w:r>
+    </w:p>
+    <w:p>
+      <w:pPr>
+        <w:pStyle w:val="Normal"/>
+        <w:bidi w:val="0"/>
+        <w:jc w:val="start"/>
+        <w:rPr/>
+      </w:pPr>
+      <w:bookmarkStart w:id="25" w:name="__DdeLink__133_2894387740"/>
+      <w:bookmarkStart w:id="26" w:name="__DdeLink__136_2894387740"/>
+      <w:r>
+        <w:rPr/>
+        <w:t>NOTE: “Test Chain” has chain_ id = 4.</w:t>
+      </w:r>
       <w:bookmarkEnd w:id="25"/>
+      <w:bookmarkEnd w:id="26"/>
     </w:p>
     <w:p>
       <w:pPr>
@@ -3275,72 +3350,825 @@
       </w:pPr>
       <w:r>
         <w:rPr/>
-        <w:t>* Change the chain_headquarters_address_room_no of “Test Chain” to NULL.</w:t>
-      </w:r>
-    </w:p>
-    <w:p>
-      <w:pPr>
-        <w:pStyle w:val="Normal"/>
-        <w:bidi w:val="0"/>
-        <w:jc w:val="start"/>
-        <w:rPr/>
-      </w:pPr>
-      <w:r>
-        <w:rPr/>
-        <w:t>* Change the chain_headquarters_address_room_no from NULL to “16”.</w:t>
-      </w:r>
-    </w:p>
-    <w:p>
-      <w:pPr>
-        <w:pStyle w:val="Normal"/>
-        <w:bidi w:val="0"/>
-        <w:jc w:val="start"/>
-        <w:rPr/>
-      </w:pPr>
-      <w:r>
-        <w:rPr/>
-        <w:t>* Change the chain_headquarters_address_building of “Test Chain” to NULL.</w:t>
-      </w:r>
-    </w:p>
-    <w:p>
-      <w:pPr>
-        <w:pStyle w:val="Normal"/>
-        <w:bidi w:val="0"/>
-        <w:jc w:val="start"/>
-        <w:rPr/>
-      </w:pPr>
-      <w:r>
-        <w:rPr/>
-        <w:t>* Change the chain_headquarters_address_building of “Test Chain” from NULL to “TEST BUILDING”.</w:t>
-      </w:r>
-    </w:p>
-    <w:p>
-      <w:pPr>
-        <w:pStyle w:val="Normal"/>
-        <w:bidi w:val="0"/>
-        <w:jc w:val="start"/>
-        <w:rPr/>
-      </w:pPr>
-      <w:r>
-        <w:rPr/>
-        <w:t>* Delete the CHAIN that has chain_id = 3.</w:t>
-      </w:r>
-    </w:p>
-    <w:p>
-      <w:pPr>
-        <w:pStyle w:val="Normal"/>
-        <w:bidi w:val="0"/>
-        <w:jc w:val="start"/>
-        <w:rPr/>
-      </w:pPr>
-      <w:bookmarkStart w:id="26" w:name="__DdeLink__136_2894387740"/>
-      <w:bookmarkStart w:id="27" w:name="__DdeLink__133_2894387740"/>
-      <w:r>
-        <w:rPr/>
-        <w:t>NOTE: “Test Chain” has chain_ id = 4.</w:t>
-      </w:r>
-      <w:bookmarkEnd w:id="26"/>
-      <w:bookmarkEnd w:id="27"/>
+      </w:r>
+    </w:p>
+    <w:p>
+      <w:pPr>
+        <w:pStyle w:val="Normal"/>
+        <w:bidi w:val="0"/>
+        <w:jc w:val="center"/>
+        <w:rPr>
+          <w:b/>
+          <w:bCs/>
+        </w:rPr>
+      </w:pPr>
+      <w:r>
+        <w:rPr>
+          <w:b/>
+          <w:bCs/>
+        </w:rPr>
+      </w:r>
+    </w:p>
+    <w:p>
+      <w:pPr>
+        <w:pStyle w:val="Normal"/>
+        <w:bidi w:val="0"/>
+        <w:jc w:val="center"/>
+        <w:rPr>
+          <w:b/>
+          <w:bCs/>
+        </w:rPr>
+      </w:pPr>
+      <w:r>
+        <w:rPr>
+          <w:b/>
+          <w:bCs/>
+        </w:rPr>
+      </w:r>
+    </w:p>
+    <w:p>
+      <w:pPr>
+        <w:pStyle w:val="Normal"/>
+        <w:bidi w:val="0"/>
+        <w:jc w:val="center"/>
+        <w:rPr>
+          <w:b/>
+          <w:bCs/>
+        </w:rPr>
+      </w:pPr>
+      <w:r>
+        <w:rPr>
+          <w:b/>
+          <w:bCs/>
+        </w:rPr>
+      </w:r>
+    </w:p>
+    <w:p>
+      <w:pPr>
+        <w:pStyle w:val="Normal"/>
+        <w:bidi w:val="0"/>
+        <w:jc w:val="center"/>
+        <w:rPr>
+          <w:b/>
+          <w:bCs/>
+        </w:rPr>
+      </w:pPr>
+      <w:r>
+        <w:rPr>
+          <w:b/>
+          <w:bCs/>
+        </w:rPr>
+      </w:r>
+    </w:p>
+    <w:p>
+      <w:pPr>
+        <w:pStyle w:val="Normal"/>
+        <w:bidi w:val="0"/>
+        <w:jc w:val="center"/>
+        <w:rPr>
+          <w:b/>
+          <w:bCs/>
+        </w:rPr>
+      </w:pPr>
+      <w:r>
+        <w:rPr>
+          <w:b/>
+          <w:bCs/>
+        </w:rPr>
+      </w:r>
+    </w:p>
+    <w:p>
+      <w:pPr>
+        <w:pStyle w:val="Normal"/>
+        <w:bidi w:val="0"/>
+        <w:jc w:val="center"/>
+        <w:rPr>
+          <w:b/>
+          <w:bCs/>
+        </w:rPr>
+      </w:pPr>
+      <w:r>
+        <w:rPr>
+          <w:b/>
+          <w:bCs/>
+        </w:rPr>
+        <w:t>UNIT TESTS</w:t>
+      </w:r>
+    </w:p>
+    <w:p>
+      <w:pPr>
+        <w:pStyle w:val="Normal"/>
+        <w:bidi w:val="0"/>
+        <w:jc w:val="both"/>
+        <w:rPr>
+          <w:b w:val="false"/>
+          <w:bCs w:val="false"/>
+        </w:rPr>
+      </w:pPr>
+      <w:bookmarkStart w:id="27" w:name="__DdeLink__274_3299975041"/>
+      <w:r>
+        <w:rPr>
+          <w:b w:val="false"/>
+          <w:bCs w:val="false"/>
+        </w:rPr>
+        <w:t>The following unit tests should take place by bypassing the DTOs and using the methods of chains.service.ts.</w:t>
+      </w:r>
+    </w:p>
+    <w:p>
+      <w:pPr>
+        <w:pStyle w:val="Normal"/>
+        <w:bidi w:val="0"/>
+        <w:jc w:val="both"/>
+        <w:rPr>
+          <w:b w:val="false"/>
+        </w:rPr>
+      </w:pPr>
+      <w:r>
+        <w:rPr>
+          <w:b w:val="false"/>
+          <w:bCs w:val="false"/>
+        </w:rPr>
+        <w:t xml:space="preserve"> </w:t>
+      </w:r>
+      <w:r>
+        <w:rPr>
+          <w:b w:val="false"/>
+          <w:bCs w:val="false"/>
+        </w:rPr>
+        <w:t xml:space="preserve">* Unit test to create a Chain using the createChain method with the following data: </w:t>
+      </w:r>
+      <w:r>
+        <w:rPr>
+          <w:rFonts w:ascii="Droid Sans Mono;monospace" w:hAnsi="Droid Sans Mono;monospace"/>
+          <w:b w:val="false"/>
+          <w:color w:val="8B949E"/>
+          <w:sz w:val="21"/>
+          <w:shd w:fill="121314" w:val="clear"/>
+        </w:rPr>
+        <w:t>{</w:t>
+      </w:r>
+    </w:p>
+    <w:p>
+      <w:pPr>
+        <w:pStyle w:val="Normal"/>
+        <w:spacing w:lineRule="atLeast" w:line="285"/>
+        <w:ind w:hanging="0" w:start="0" w:end="0"/>
+        <w:rPr>
+          <w:rFonts w:ascii="Droid Sans Mono;monospace" w:hAnsi="Droid Sans Mono;monospace"/>
+          <w:b w:val="false"/>
+          <w:color w:val="8B949E"/>
+          <w:sz w:val="21"/>
+          <w:shd w:fill="121314" w:val="clear"/>
+        </w:rPr>
+      </w:pPr>
+      <w:r>
+        <w:rPr>
+          <w:rFonts w:ascii="Droid Sans Mono;monospace" w:hAnsi="Droid Sans Mono;monospace"/>
+          <w:b w:val="false"/>
+          <w:color w:val="8B949E"/>
+          <w:sz w:val="21"/>
+          <w:shd w:fill="121314" w:val="clear"/>
+        </w:rPr>
+        <w:t>"chain_id": 4,</w:t>
+      </w:r>
+    </w:p>
+    <w:p>
+      <w:pPr>
+        <w:pStyle w:val="Normal"/>
+        <w:spacing w:lineRule="atLeast" w:line="285"/>
+        <w:ind w:hanging="0" w:start="0" w:end="0"/>
+        <w:rPr>
+          <w:rFonts w:ascii="Droid Sans Mono;monospace" w:hAnsi="Droid Sans Mono;monospace"/>
+          <w:b w:val="false"/>
+          <w:color w:val="8B949E"/>
+          <w:sz w:val="21"/>
+          <w:shd w:fill="121314" w:val="clear"/>
+        </w:rPr>
+      </w:pPr>
+      <w:r>
+        <w:rPr>
+          <w:rFonts w:ascii="Droid Sans Mono;monospace" w:hAnsi="Droid Sans Mono;monospace"/>
+          <w:b w:val="false"/>
+          <w:color w:val="8B949E"/>
+          <w:sz w:val="21"/>
+          <w:shd w:fill="121314" w:val="clear"/>
+        </w:rPr>
+        <w:t>"chain_date_created_at": "2026-08-26T11:07:33.216241+05:30",</w:t>
+      </w:r>
+    </w:p>
+    <w:p>
+      <w:pPr>
+        <w:pStyle w:val="Normal"/>
+        <w:spacing w:lineRule="atLeast" w:line="285"/>
+        <w:ind w:hanging="0" w:start="0" w:end="0"/>
+        <w:rPr>
+          <w:rFonts w:ascii="Droid Sans Mono;monospace" w:hAnsi="Droid Sans Mono;monospace"/>
+          <w:b w:val="false"/>
+          <w:color w:val="8B949E"/>
+          <w:sz w:val="21"/>
+          <w:shd w:fill="121314" w:val="clear"/>
+        </w:rPr>
+      </w:pPr>
+      <w:r>
+        <w:rPr>
+          <w:rFonts w:ascii="Droid Sans Mono;monospace" w:hAnsi="Droid Sans Mono;monospace"/>
+          <w:b w:val="false"/>
+          <w:color w:val="8B949E"/>
+          <w:sz w:val="21"/>
+          <w:shd w:fill="121314" w:val="clear"/>
+        </w:rPr>
+        <w:t>"chain_name": "Test Chain",</w:t>
+      </w:r>
+    </w:p>
+    <w:p>
+      <w:pPr>
+        <w:pStyle w:val="Normal"/>
+        <w:spacing w:lineRule="atLeast" w:line="285"/>
+        <w:ind w:hanging="0" w:start="0" w:end="0"/>
+        <w:rPr>
+          <w:rFonts w:ascii="Droid Sans Mono;monospace" w:hAnsi="Droid Sans Mono;monospace"/>
+          <w:b w:val="false"/>
+          <w:color w:val="8B949E"/>
+          <w:sz w:val="21"/>
+          <w:shd w:fill="121314" w:val="clear"/>
+        </w:rPr>
+      </w:pPr>
+      <w:r>
+        <w:rPr>
+          <w:rFonts w:ascii="Droid Sans Mono;monospace" w:hAnsi="Droid Sans Mono;monospace"/>
+          <w:b w:val="false"/>
+          <w:color w:val="8B949E"/>
+          <w:sz w:val="21"/>
+          <w:shd w:fill="121314" w:val="clear"/>
+        </w:rPr>
+        <w:t>"chain_headquarters_address_room_no": "16",</w:t>
+      </w:r>
+    </w:p>
+    <w:p>
+      <w:pPr>
+        <w:pStyle w:val="Normal"/>
+        <w:spacing w:lineRule="atLeast" w:line="285"/>
+        <w:ind w:hanging="0" w:start="0" w:end="0"/>
+        <w:rPr>
+          <w:rFonts w:ascii="Droid Sans Mono;monospace" w:hAnsi="Droid Sans Mono;monospace"/>
+          <w:b w:val="false"/>
+          <w:color w:val="8B949E"/>
+          <w:sz w:val="21"/>
+          <w:shd w:fill="121314" w:val="clear"/>
+        </w:rPr>
+      </w:pPr>
+      <w:r>
+        <w:rPr>
+          <w:rFonts w:ascii="Droid Sans Mono;monospace" w:hAnsi="Droid Sans Mono;monospace"/>
+          <w:b w:val="false"/>
+          <w:color w:val="8B949E"/>
+          <w:sz w:val="21"/>
+          <w:shd w:fill="121314" w:val="clear"/>
+        </w:rPr>
+        <w:t>"chain_headquarters_address_building": "TEST BUILDING",</w:t>
+      </w:r>
+    </w:p>
+    <w:p>
+      <w:pPr>
+        <w:pStyle w:val="Normal"/>
+        <w:spacing w:lineRule="atLeast" w:line="285"/>
+        <w:ind w:hanging="0" w:start="0" w:end="0"/>
+        <w:rPr>
+          <w:rFonts w:ascii="Droid Sans Mono;monospace" w:hAnsi="Droid Sans Mono;monospace"/>
+          <w:b w:val="false"/>
+          <w:color w:val="8B949E"/>
+          <w:sz w:val="21"/>
+          <w:shd w:fill="121314" w:val="clear"/>
+        </w:rPr>
+      </w:pPr>
+      <w:r>
+        <w:rPr>
+          <w:rFonts w:ascii="Droid Sans Mono;monospace" w:hAnsi="Droid Sans Mono;monospace"/>
+          <w:b w:val="false"/>
+          <w:color w:val="8B949E"/>
+          <w:sz w:val="21"/>
+          <w:shd w:fill="121314" w:val="clear"/>
+        </w:rPr>
+        <w:t>"chain_headquarters_address_street": "Test Street",</w:t>
+      </w:r>
+    </w:p>
+    <w:p>
+      <w:pPr>
+        <w:pStyle w:val="Normal"/>
+        <w:spacing w:lineRule="atLeast" w:line="285"/>
+        <w:ind w:hanging="0" w:start="0" w:end="0"/>
+        <w:rPr>
+          <w:rFonts w:ascii="Droid Sans Mono;monospace" w:hAnsi="Droid Sans Mono;monospace"/>
+          <w:b w:val="false"/>
+          <w:color w:val="8B949E"/>
+          <w:sz w:val="21"/>
+          <w:shd w:fill="121314" w:val="clear"/>
+        </w:rPr>
+      </w:pPr>
+      <w:r>
+        <w:rPr>
+          <w:rFonts w:ascii="Droid Sans Mono;monospace" w:hAnsi="Droid Sans Mono;monospace"/>
+          <w:b w:val="false"/>
+          <w:color w:val="8B949E"/>
+          <w:sz w:val="21"/>
+          <w:shd w:fill="121314" w:val="clear"/>
+        </w:rPr>
+        <w:t>"chain_headquarters_address_city": "Test City",</w:t>
+      </w:r>
+    </w:p>
+    <w:p>
+      <w:pPr>
+        <w:pStyle w:val="Normal"/>
+        <w:spacing w:lineRule="atLeast" w:line="285"/>
+        <w:ind w:hanging="0" w:start="0" w:end="0"/>
+        <w:rPr>
+          <w:rFonts w:ascii="Droid Sans Mono;monospace" w:hAnsi="Droid Sans Mono;monospace"/>
+          <w:b w:val="false"/>
+          <w:color w:val="8B949E"/>
+          <w:sz w:val="21"/>
+          <w:shd w:fill="121314" w:val="clear"/>
+        </w:rPr>
+      </w:pPr>
+      <w:r>
+        <w:rPr>
+          <w:rFonts w:ascii="Droid Sans Mono;monospace" w:hAnsi="Droid Sans Mono;monospace"/>
+          <w:b w:val="false"/>
+          <w:color w:val="8B949E"/>
+          <w:sz w:val="21"/>
+          <w:shd w:fill="121314" w:val="clear"/>
+        </w:rPr>
+        <w:t>"chain_headquarters_address_admin_division": "Test Division",</w:t>
+      </w:r>
+    </w:p>
+    <w:p>
+      <w:pPr>
+        <w:pStyle w:val="Normal"/>
+        <w:spacing w:lineRule="atLeast" w:line="285"/>
+        <w:ind w:hanging="0" w:start="0" w:end="0"/>
+        <w:rPr>
+          <w:rFonts w:ascii="Droid Sans Mono;monospace" w:hAnsi="Droid Sans Mono;monospace"/>
+          <w:b w:val="false"/>
+          <w:color w:val="8B949E"/>
+          <w:sz w:val="21"/>
+          <w:shd w:fill="121314" w:val="clear"/>
+        </w:rPr>
+      </w:pPr>
+      <w:r>
+        <w:rPr>
+          <w:rFonts w:ascii="Droid Sans Mono;monospace" w:hAnsi="Droid Sans Mono;monospace"/>
+          <w:b w:val="false"/>
+          <w:color w:val="8B949E"/>
+          <w:sz w:val="21"/>
+          <w:shd w:fill="121314" w:val="clear"/>
+        </w:rPr>
+        <w:t>"chain_headquarters_address_country": "India",</w:t>
+      </w:r>
+    </w:p>
+    <w:p>
+      <w:pPr>
+        <w:pStyle w:val="Normal"/>
+        <w:spacing w:lineRule="atLeast" w:line="285"/>
+        <w:ind w:hanging="0" w:start="0" w:end="0"/>
+        <w:rPr>
+          <w:rFonts w:ascii="Droid Sans Mono;monospace" w:hAnsi="Droid Sans Mono;monospace"/>
+          <w:b w:val="false"/>
+          <w:color w:val="8B949E"/>
+          <w:sz w:val="21"/>
+          <w:shd w:fill="121314" w:val="clear"/>
+        </w:rPr>
+      </w:pPr>
+      <w:r>
+        <w:rPr>
+          <w:rFonts w:ascii="Droid Sans Mono;monospace" w:hAnsi="Droid Sans Mono;monospace"/>
+          <w:b w:val="false"/>
+          <w:color w:val="8B949E"/>
+          <w:sz w:val="21"/>
+          <w:shd w:fill="121314" w:val="clear"/>
+        </w:rPr>
+        <w:t>"chain_headquarters_address_post_code": "560001"</w:t>
+      </w:r>
+    </w:p>
+    <w:p>
+      <w:pPr>
+        <w:pStyle w:val="Normal"/>
+        <w:spacing w:lineRule="atLeast" w:line="285"/>
+        <w:ind w:hanging="0" w:start="0" w:end="0"/>
+        <w:rPr>
+          <w:rFonts w:ascii="Droid Sans Mono;monospace" w:hAnsi="Droid Sans Mono;monospace"/>
+          <w:b w:val="false"/>
+          <w:color w:val="8B949E"/>
+          <w:sz w:val="21"/>
+          <w:shd w:fill="121314" w:val="clear"/>
+        </w:rPr>
+      </w:pPr>
+      <w:r>
+        <w:rPr>
+          <w:rFonts w:ascii="Droid Sans Mono;monospace" w:hAnsi="Droid Sans Mono;monospace"/>
+          <w:b w:val="false"/>
+          <w:color w:val="8B949E"/>
+          <w:sz w:val="21"/>
+          <w:shd w:fill="121314" w:val="clear"/>
+        </w:rPr>
+        <w:t>}</w:t>
+      </w:r>
+    </w:p>
+    <w:p>
+      <w:pPr>
+        <w:pStyle w:val="Normal"/>
+        <w:bidi w:val="0"/>
+        <w:jc w:val="both"/>
+        <w:rPr>
+          <w:b w:val="false"/>
+          <w:bCs w:val="false"/>
+        </w:rPr>
+      </w:pPr>
+      <w:r>
+        <w:rPr>
+          <w:b w:val="false"/>
+          <w:bCs w:val="false"/>
+        </w:rPr>
+      </w:r>
+    </w:p>
+    <w:p>
+      <w:pPr>
+        <w:pStyle w:val="Normal"/>
+        <w:bidi w:val="0"/>
+        <w:jc w:val="both"/>
+        <w:rPr>
+          <w:b w:val="false"/>
+          <w:bCs w:val="false"/>
+        </w:rPr>
+      </w:pPr>
+      <w:r>
+        <w:rPr>
+          <w:b w:val="false"/>
+          <w:bCs w:val="false"/>
+        </w:rPr>
+        <w:t xml:space="preserve">* Unit test to Update the chain_name </w:t>
+      </w:r>
+      <w:bookmarkStart w:id="28" w:name="__DdeLink__253_3299975041"/>
+      <w:r>
+        <w:rPr>
+          <w:b w:val="false"/>
+          <w:bCs w:val="false"/>
+        </w:rPr>
+        <w:t>of record with chain_id = 4</w:t>
+      </w:r>
+      <w:bookmarkEnd w:id="28"/>
+      <w:r>
+        <w:rPr>
+          <w:b w:val="false"/>
+          <w:bCs w:val="false"/>
+        </w:rPr>
+        <w:t xml:space="preserve"> to “UPDATED TEST CHAIN NAME” using the updateChainName method.</w:t>
+      </w:r>
+    </w:p>
+    <w:p>
+      <w:pPr>
+        <w:pStyle w:val="Normal"/>
+        <w:bidi w:val="0"/>
+        <w:jc w:val="both"/>
+        <w:rPr>
+          <w:b w:val="false"/>
+          <w:bCs w:val="false"/>
+        </w:rPr>
+      </w:pPr>
+      <w:r>
+        <w:rPr>
+          <w:b w:val="false"/>
+          <w:bCs w:val="false"/>
+        </w:rPr>
+      </w:r>
+    </w:p>
+    <w:p>
+      <w:pPr>
+        <w:pStyle w:val="Normal"/>
+        <w:bidi w:val="0"/>
+        <w:jc w:val="both"/>
+        <w:rPr>
+          <w:b w:val="false"/>
+          <w:bCs w:val="false"/>
+        </w:rPr>
+      </w:pPr>
+      <w:bookmarkStart w:id="29" w:name="__DdeLink__255_3299975041"/>
+      <w:r>
+        <w:rPr>
+          <w:b w:val="false"/>
+          <w:bCs w:val="false"/>
+        </w:rPr>
+        <w:t>* Unit test to Update the chain_headquarters_address_room_no of record with chain_id = 4 to “22” using the updateChainAddress method.</w:t>
+      </w:r>
+      <w:bookmarkEnd w:id="29"/>
+    </w:p>
+    <w:p>
+      <w:pPr>
+        <w:pStyle w:val="Normal"/>
+        <w:bidi w:val="0"/>
+        <w:jc w:val="both"/>
+        <w:rPr>
+          <w:b w:val="false"/>
+          <w:bCs w:val="false"/>
+        </w:rPr>
+      </w:pPr>
+      <w:r>
+        <w:rPr>
+          <w:b w:val="false"/>
+          <w:bCs w:val="false"/>
+        </w:rPr>
+      </w:r>
+    </w:p>
+    <w:p>
+      <w:pPr>
+        <w:pStyle w:val="Normal"/>
+        <w:bidi w:val="0"/>
+        <w:jc w:val="both"/>
+        <w:rPr>
+          <w:b w:val="false"/>
+          <w:bCs w:val="false"/>
+        </w:rPr>
+      </w:pPr>
+      <w:bookmarkStart w:id="30" w:name="__DdeLink__257_3299975041"/>
+      <w:r>
+        <w:rPr>
+          <w:b w:val="false"/>
+          <w:bCs w:val="false"/>
+        </w:rPr>
+        <w:t>* Unit test to Update the chain_headquarters_address_building of record with chain_id = 4 to “CHAIN HQ ADDRESS BUILDING” using the updateChainAddress method.</w:t>
+      </w:r>
+      <w:bookmarkEnd w:id="30"/>
+    </w:p>
+    <w:p>
+      <w:pPr>
+        <w:pStyle w:val="Normal"/>
+        <w:bidi w:val="0"/>
+        <w:jc w:val="both"/>
+        <w:rPr>
+          <w:b w:val="false"/>
+          <w:bCs w:val="false"/>
+        </w:rPr>
+      </w:pPr>
+      <w:r>
+        <w:rPr>
+          <w:b w:val="false"/>
+          <w:bCs w:val="false"/>
+        </w:rPr>
+      </w:r>
+    </w:p>
+    <w:p>
+      <w:pPr>
+        <w:pStyle w:val="Normal"/>
+        <w:bidi w:val="0"/>
+        <w:jc w:val="both"/>
+        <w:rPr>
+          <w:b w:val="false"/>
+          <w:bCs w:val="false"/>
+        </w:rPr>
+      </w:pPr>
+      <w:bookmarkStart w:id="31" w:name="__DdeLink__259_3299975041"/>
+      <w:r>
+        <w:rPr>
+          <w:b w:val="false"/>
+          <w:bCs w:val="false"/>
+        </w:rPr>
+        <w:t>* Unit test to Update the chain_headquarters_address_street of record with chain_id = 4 to “CHAIN HQ ADDRESS STREET” using the updateChainAddress method.</w:t>
+      </w:r>
+      <w:bookmarkEnd w:id="31"/>
+    </w:p>
+    <w:p>
+      <w:pPr>
+        <w:pStyle w:val="Normal"/>
+        <w:bidi w:val="0"/>
+        <w:jc w:val="both"/>
+        <w:rPr>
+          <w:b w:val="false"/>
+          <w:bCs w:val="false"/>
+        </w:rPr>
+      </w:pPr>
+      <w:r>
+        <w:rPr>
+          <w:b w:val="false"/>
+          <w:bCs w:val="false"/>
+        </w:rPr>
+      </w:r>
+    </w:p>
+    <w:p>
+      <w:pPr>
+        <w:pStyle w:val="Normal"/>
+        <w:bidi w:val="0"/>
+        <w:jc w:val="both"/>
+        <w:rPr>
+          <w:b w:val="false"/>
+          <w:bCs w:val="false"/>
+        </w:rPr>
+      </w:pPr>
+      <w:bookmarkStart w:id="32" w:name="__DdeLink__261_3299975041"/>
+      <w:r>
+        <w:rPr>
+          <w:b w:val="false"/>
+          <w:bCs w:val="false"/>
+        </w:rPr>
+        <w:t>* Unit test to Update the chain_headquarters_address_city of record with chain_id = 4 to “CHAIN HQ ADDRESS CITY” using the updateChainAddress method.</w:t>
+      </w:r>
+      <w:bookmarkEnd w:id="32"/>
+    </w:p>
+    <w:p>
+      <w:pPr>
+        <w:pStyle w:val="Normal"/>
+        <w:bidi w:val="0"/>
+        <w:jc w:val="both"/>
+        <w:rPr>
+          <w:b w:val="false"/>
+          <w:bCs w:val="false"/>
+        </w:rPr>
+      </w:pPr>
+      <w:r>
+        <w:rPr>
+          <w:b w:val="false"/>
+          <w:bCs w:val="false"/>
+        </w:rPr>
+      </w:r>
+    </w:p>
+    <w:p>
+      <w:pPr>
+        <w:pStyle w:val="Normal"/>
+        <w:bidi w:val="0"/>
+        <w:jc w:val="both"/>
+        <w:rPr>
+          <w:b w:val="false"/>
+          <w:bCs w:val="false"/>
+        </w:rPr>
+      </w:pPr>
+      <w:bookmarkStart w:id="33" w:name="__DdeLink__263_3299975041"/>
+      <w:r>
+        <w:rPr>
+          <w:b w:val="false"/>
+          <w:bCs w:val="false"/>
+        </w:rPr>
+        <w:t>* Unit test to Update the chain_headquarters_address_admin_division of record with chain_id = 4 to “CHAIN HQ ADDRESS ADMIN DIVISION” using the updateChainAddress method.</w:t>
+      </w:r>
+      <w:bookmarkEnd w:id="33"/>
+    </w:p>
+    <w:p>
+      <w:pPr>
+        <w:pStyle w:val="Normal"/>
+        <w:bidi w:val="0"/>
+        <w:jc w:val="both"/>
+        <w:rPr>
+          <w:b w:val="false"/>
+          <w:bCs w:val="false"/>
+        </w:rPr>
+      </w:pPr>
+      <w:r>
+        <w:rPr>
+          <w:b w:val="false"/>
+          <w:bCs w:val="false"/>
+        </w:rPr>
+      </w:r>
+    </w:p>
+    <w:p>
+      <w:pPr>
+        <w:pStyle w:val="Normal"/>
+        <w:bidi w:val="0"/>
+        <w:jc w:val="both"/>
+        <w:rPr>
+          <w:b w:val="false"/>
+          <w:bCs w:val="false"/>
+        </w:rPr>
+      </w:pPr>
+      <w:bookmarkStart w:id="34" w:name="__DdeLink__265_3299975041"/>
+      <w:r>
+        <w:rPr>
+          <w:b w:val="false"/>
+          <w:bCs w:val="false"/>
+        </w:rPr>
+        <w:t>* Unit test to Update the chain_headquarters_address_country of record with chain_id = 4 to “CHAIN HQ ADDRESS COUNTRY” using the updateChainAddress method.</w:t>
+      </w:r>
+      <w:bookmarkEnd w:id="34"/>
+    </w:p>
+    <w:p>
+      <w:pPr>
+        <w:pStyle w:val="Normal"/>
+        <w:bidi w:val="0"/>
+        <w:jc w:val="both"/>
+        <w:rPr>
+          <w:b w:val="false"/>
+          <w:bCs w:val="false"/>
+        </w:rPr>
+      </w:pPr>
+      <w:r>
+        <w:rPr>
+          <w:b w:val="false"/>
+          <w:bCs w:val="false"/>
+        </w:rPr>
+      </w:r>
+    </w:p>
+    <w:p>
+      <w:pPr>
+        <w:pStyle w:val="Normal"/>
+        <w:bidi w:val="0"/>
+        <w:jc w:val="both"/>
+        <w:rPr>
+          <w:b w:val="false"/>
+          <w:bCs w:val="false"/>
+        </w:rPr>
+      </w:pPr>
+      <w:r>
+        <w:rPr>
+          <w:b w:val="false"/>
+          <w:bCs w:val="false"/>
+        </w:rPr>
+        <w:t>* Unit test to Update the chain_headquarters_address_post_code of record with chain_id = 4 to “313456” using the updateChainAddress method.</w:t>
+      </w:r>
+    </w:p>
+    <w:p>
+      <w:pPr>
+        <w:pStyle w:val="Normal"/>
+        <w:bidi w:val="0"/>
+        <w:jc w:val="both"/>
+        <w:rPr>
+          <w:b w:val="false"/>
+          <w:bCs w:val="false"/>
+        </w:rPr>
+      </w:pPr>
+      <w:r>
+        <w:rPr>
+          <w:b w:val="false"/>
+          <w:bCs w:val="false"/>
+        </w:rPr>
+      </w:r>
+    </w:p>
+    <w:p>
+      <w:pPr>
+        <w:pStyle w:val="Normal"/>
+        <w:bidi w:val="0"/>
+        <w:jc w:val="both"/>
+        <w:rPr>
+          <w:b w:val="false"/>
+          <w:bCs w:val="false"/>
+        </w:rPr>
+      </w:pPr>
+      <w:r>
+        <w:rPr>
+          <w:b w:val="false"/>
+          <w:bCs w:val="false"/>
+        </w:rPr>
+        <w:t>* Unit test to find a chain with chain_id = 4 using the findOneChain method.</w:t>
+      </w:r>
+    </w:p>
+    <w:p>
+      <w:pPr>
+        <w:pStyle w:val="Normal"/>
+        <w:bidi w:val="0"/>
+        <w:jc w:val="both"/>
+        <w:rPr>
+          <w:b w:val="false"/>
+          <w:bCs w:val="false"/>
+        </w:rPr>
+      </w:pPr>
+      <w:r>
+        <w:rPr>
+          <w:b w:val="false"/>
+          <w:bCs w:val="false"/>
+        </w:rPr>
+      </w:r>
+    </w:p>
+    <w:p>
+      <w:pPr>
+        <w:pStyle w:val="Normal"/>
+        <w:bidi w:val="0"/>
+        <w:jc w:val="both"/>
+        <w:rPr>
+          <w:b w:val="false"/>
+          <w:bCs w:val="false"/>
+        </w:rPr>
+      </w:pPr>
+      <w:bookmarkStart w:id="35" w:name="__DdeLink__274_3299975041"/>
+      <w:r>
+        <w:rPr>
+          <w:b w:val="false"/>
+          <w:bCs w:val="false"/>
+        </w:rPr>
+        <w:t>* Unit test to remove the chain with chain_id = 4 using the removeChain method.</w:t>
+      </w:r>
+      <w:bookmarkEnd w:id="35"/>
+    </w:p>
+    <w:p>
+      <w:pPr>
+        <w:pStyle w:val="Normal"/>
+        <w:bidi w:val="0"/>
+        <w:jc w:val="both"/>
+        <w:rPr>
+          <w:b w:val="false"/>
+          <w:bCs w:val="false"/>
+        </w:rPr>
+      </w:pPr>
+      <w:r>
+        <w:rPr>
+          <w:b w:val="false"/>
+          <w:bCs w:val="false"/>
+        </w:rPr>
+        <w:t xml:space="preserve">   </w:t>
+      </w:r>
     </w:p>
     <w:sectPr>
       <w:type w:val="nextPage"/>
@@ -3379,7 +4207,7 @@
     <w:pPr>
       <w:widowControl/>
       <w:suppressAutoHyphens w:val="true"/>
-      <w:overflowPunct w:val="false"/>
+      <w:overflowPunct w:val="true"/>
       <w:bidi w:val="0"/>
       <w:spacing w:before="0" w:after="0"/>
       <w:jc w:val="start"/>

</xml_diff>

<commit_message>
Added unit tests to chain, outlet and comment API specs.
</commit_message>
<xml_diff>
--- a/Portal_Database_Design/APIs/Chain_APIs.docx
+++ b/Portal_Database_Design/APIs/Chain_APIs.docx
@@ -20,8 +20,8 @@
         <w:gridCol w:w="1617"/>
         <w:gridCol w:w="1601"/>
         <w:gridCol w:w="1612"/>
-        <w:gridCol w:w="1608"/>
-        <w:gridCol w:w="1604"/>
+        <w:gridCol w:w="1225"/>
+        <w:gridCol w:w="1987"/>
       </w:tblGrid>
       <w:tr>
         <w:trPr/>
@@ -227,7 +227,7 @@
         </w:tc>
         <w:tc>
           <w:tcPr>
-            <w:tcW w:w="1608" w:type="dxa"/>
+            <w:tcW w:w="1225" w:type="dxa"/>
             <w:tcBorders>
               <w:top w:val="single" w:sz="4" w:space="0" w:color="000000"/>
               <w:start w:val="single" w:sz="4" w:space="0" w:color="000000"/>
@@ -277,7 +277,7 @@
         </w:tc>
         <w:tc>
           <w:tcPr>
-            <w:tcW w:w="1604" w:type="dxa"/>
+            <w:tcW w:w="1987" w:type="dxa"/>
             <w:tcBorders>
               <w:top w:val="single" w:sz="4" w:space="0" w:color="000000"/>
               <w:start w:val="single" w:sz="4" w:space="0" w:color="000000"/>
@@ -527,7 +527,7 @@
         </w:tc>
         <w:tc>
           <w:tcPr>
-            <w:tcW w:w="1608" w:type="dxa"/>
+            <w:tcW w:w="1225" w:type="dxa"/>
             <w:tcBorders>
               <w:start w:val="single" w:sz="4" w:space="0" w:color="000000"/>
               <w:bottom w:val="single" w:sz="4" w:space="0" w:color="000000"/>
@@ -576,7 +576,7 @@
         </w:tc>
         <w:tc>
           <w:tcPr>
-            <w:tcW w:w="1604" w:type="dxa"/>
+            <w:tcW w:w="1987" w:type="dxa"/>
             <w:tcBorders>
               <w:start w:val="single" w:sz="4" w:space="0" w:color="000000"/>
               <w:bottom w:val="single" w:sz="4" w:space="0" w:color="000000"/>
@@ -844,7 +844,7 @@
         </w:tc>
         <w:tc>
           <w:tcPr>
-            <w:tcW w:w="1608" w:type="dxa"/>
+            <w:tcW w:w="1225" w:type="dxa"/>
             <w:tcBorders>
               <w:start w:val="single" w:sz="4" w:space="0" w:color="000000"/>
               <w:bottom w:val="single" w:sz="4" w:space="0" w:color="000000"/>
@@ -893,7 +893,7 @@
         </w:tc>
         <w:tc>
           <w:tcPr>
-            <w:tcW w:w="1604" w:type="dxa"/>
+            <w:tcW w:w="1987" w:type="dxa"/>
             <w:tcBorders>
               <w:start w:val="single" w:sz="4" w:space="0" w:color="000000"/>
               <w:bottom w:val="single" w:sz="4" w:space="0" w:color="000000"/>
@@ -1161,7 +1161,7 @@
         </w:tc>
         <w:tc>
           <w:tcPr>
-            <w:tcW w:w="1608" w:type="dxa"/>
+            <w:tcW w:w="1225" w:type="dxa"/>
             <w:tcBorders>
               <w:start w:val="single" w:sz="4" w:space="0" w:color="000000"/>
               <w:bottom w:val="single" w:sz="4" w:space="0" w:color="000000"/>
@@ -1210,7 +1210,7 @@
         </w:tc>
         <w:tc>
           <w:tcPr>
-            <w:tcW w:w="1604" w:type="dxa"/>
+            <w:tcW w:w="1987" w:type="dxa"/>
             <w:tcBorders>
               <w:start w:val="single" w:sz="4" w:space="0" w:color="000000"/>
               <w:bottom w:val="single" w:sz="4" w:space="0" w:color="000000"/>
@@ -1478,7 +1478,7 @@
         </w:tc>
         <w:tc>
           <w:tcPr>
-            <w:tcW w:w="1608" w:type="dxa"/>
+            <w:tcW w:w="1225" w:type="dxa"/>
             <w:tcBorders>
               <w:start w:val="single" w:sz="4" w:space="0" w:color="000000"/>
               <w:bottom w:val="single" w:sz="4" w:space="0" w:color="000000"/>
@@ -1527,7 +1527,7 @@
         </w:tc>
         <w:tc>
           <w:tcPr>
-            <w:tcW w:w="1604" w:type="dxa"/>
+            <w:tcW w:w="1987" w:type="dxa"/>
             <w:tcBorders>
               <w:start w:val="single" w:sz="4" w:space="0" w:color="000000"/>
               <w:bottom w:val="single" w:sz="4" w:space="0" w:color="000000"/>
@@ -1778,7 +1778,7 @@
         </w:tc>
         <w:tc>
           <w:tcPr>
-            <w:tcW w:w="1608" w:type="dxa"/>
+            <w:tcW w:w="1225" w:type="dxa"/>
             <w:tcBorders>
               <w:start w:val="single" w:sz="4" w:space="0" w:color="000000"/>
               <w:bottom w:val="single" w:sz="4" w:space="0" w:color="000000"/>
@@ -1827,7 +1827,7 @@
         </w:tc>
         <w:tc>
           <w:tcPr>
-            <w:tcW w:w="1604" w:type="dxa"/>
+            <w:tcW w:w="1987" w:type="dxa"/>
             <w:tcBorders>
               <w:start w:val="single" w:sz="4" w:space="0" w:color="000000"/>
               <w:bottom w:val="single" w:sz="4" w:space="0" w:color="000000"/>
@@ -2078,7 +2078,7 @@
         </w:tc>
         <w:tc>
           <w:tcPr>
-            <w:tcW w:w="1608" w:type="dxa"/>
+            <w:tcW w:w="1225" w:type="dxa"/>
             <w:tcBorders>
               <w:start w:val="single" w:sz="4" w:space="0" w:color="000000"/>
               <w:bottom w:val="single" w:sz="4" w:space="0" w:color="000000"/>
@@ -2127,7 +2127,7 @@
         </w:tc>
         <w:tc>
           <w:tcPr>
-            <w:tcW w:w="1604" w:type="dxa"/>
+            <w:tcW w:w="1987" w:type="dxa"/>
             <w:tcBorders>
               <w:start w:val="single" w:sz="4" w:space="0" w:color="000000"/>
               <w:bottom w:val="single" w:sz="4" w:space="0" w:color="000000"/>
@@ -2380,7 +2380,7 @@
         </w:tc>
         <w:tc>
           <w:tcPr>
-            <w:tcW w:w="1608" w:type="dxa"/>
+            <w:tcW w:w="1225" w:type="dxa"/>
             <w:tcBorders>
               <w:start w:val="single" w:sz="4" w:space="0" w:color="000000"/>
               <w:bottom w:val="single" w:sz="4" w:space="0" w:color="000000"/>
@@ -2429,7 +2429,7 @@
         </w:tc>
         <w:tc>
           <w:tcPr>
-            <w:tcW w:w="1604" w:type="dxa"/>
+            <w:tcW w:w="1987" w:type="dxa"/>
             <w:tcBorders>
               <w:start w:val="single" w:sz="4" w:space="0" w:color="000000"/>
               <w:bottom w:val="single" w:sz="4" w:space="0" w:color="000000"/>
@@ -2521,6 +2521,7 @@
       <w:bookmarkStart w:id="6" w:name="__DdeLink__261_1626357650"/>
       <w:bookmarkStart w:id="7" w:name="__DdeLink__251_1626357650"/>
       <w:bookmarkStart w:id="8" w:name="__DdeLink__264_761320732"/>
+      <w:bookmarkStart w:id="9" w:name="__DdeLink__314_2117206406"/>
       <w:r>
         <w:rPr>
           <w:b w:val="false"/>
@@ -2563,7 +2564,7 @@
         </w:rPr>
         <w:t xml:space="preserve">updateChainName -&gt; Takes the chain_name from the DTO, the chain_id from the URL param, both from the front-end and updates the chain_name of the respective CHAIN record. </w:t>
       </w:r>
-      <w:bookmarkStart w:id="9" w:name="__DdeLink__229_1626357650"/>
+      <w:bookmarkStart w:id="10" w:name="__DdeLink__229_1626357650"/>
       <w:r>
         <w:rPr>
           <w:b w:val="false"/>
@@ -2571,8 +2572,8 @@
         </w:rPr>
         <w:t xml:space="preserve">This can only be done by a company_manager or a chain_manager. If it is being done by a chain_manager, then that chain_manager must belong to an outlet of the chain which is having its name updated. </w:t>
       </w:r>
-      <w:bookmarkStart w:id="10" w:name="__DdeLink__242_1626357650"/>
-      <w:bookmarkEnd w:id="9"/>
+      <w:bookmarkStart w:id="11" w:name="__DdeLink__242_1626357650"/>
+      <w:bookmarkEnd w:id="10"/>
       <w:r>
         <w:rPr>
           <w:b w:val="false"/>
@@ -2580,7 +2581,7 @@
         </w:rPr>
         <w:t>Note that a join between OUTLETS, CHAINS and USERS would have to be done to get the chain to which the chain_manager belongs.</w:t>
       </w:r>
-      <w:bookmarkEnd w:id="10"/>
+      <w:bookmarkEnd w:id="11"/>
     </w:p>
     <w:p>
       <w:pPr>
@@ -2616,7 +2617,7 @@
         </w:rPr>
         <w:t xml:space="preserve">updateChainAddress -&gt; Takes the chain_address_* related fields from the DTO, the chain_id from the URL param from the front-end and updates the chain_address_* related fields of the respective CHAIN record. </w:t>
       </w:r>
-      <w:bookmarkStart w:id="11" w:name="__DdeLink__233_1626357650"/>
+      <w:bookmarkStart w:id="12" w:name="__DdeLink__233_1626357650"/>
       <w:r>
         <w:rPr>
           <w:b w:val="false"/>
@@ -2624,7 +2625,7 @@
         </w:rPr>
         <w:t xml:space="preserve">This can only be done by a company_manager or a chain_manager. </w:t>
       </w:r>
-      <w:bookmarkEnd w:id="11"/>
+      <w:bookmarkEnd w:id="12"/>
       <w:r>
         <w:rPr>
           <w:b w:val="false"/>
@@ -2660,7 +2661,7 @@
           <w:bCs w:val="false"/>
         </w:rPr>
       </w:pPr>
-      <w:bookmarkStart w:id="12" w:name="__DdeLink__149_588342144"/>
+      <w:bookmarkStart w:id="13" w:name="__DdeLink__149_588342144"/>
       <w:r>
         <w:rPr>
           <w:b w:val="false"/>
@@ -2668,7 +2669,7 @@
         </w:rPr>
         <w:t xml:space="preserve">findOneChain -&gt; Takes the </w:t>
       </w:r>
-      <w:bookmarkStart w:id="13" w:name="__DdeLink__443_1184157458"/>
+      <w:bookmarkStart w:id="14" w:name="__DdeLink__443_1184157458"/>
       <w:r>
         <w:rPr>
           <w:b w:val="false"/>
@@ -2676,23 +2677,23 @@
         </w:rPr>
         <w:t>chain_id from the URL parameter from the front-end</w:t>
       </w:r>
+      <w:bookmarkEnd w:id="14"/>
+      <w:r>
+        <w:rPr>
+          <w:b w:val="false"/>
+          <w:bCs w:val="false"/>
+        </w:rPr>
+        <w:t xml:space="preserve"> and returns the respective CHAIN record.</w:t>
+      </w:r>
       <w:bookmarkEnd w:id="13"/>
       <w:r>
         <w:rPr>
           <w:b w:val="false"/>
           <w:bCs w:val="false"/>
         </w:rPr>
-        <w:t xml:space="preserve"> and returns the respective CHAIN record.</w:t>
-      </w:r>
-      <w:bookmarkEnd w:id="12"/>
-      <w:r>
-        <w:rPr>
-          <w:b w:val="false"/>
-          <w:bCs w:val="false"/>
-        </w:rPr>
         <w:t xml:space="preserve"> </w:t>
       </w:r>
-      <w:bookmarkStart w:id="14" w:name="__DdeLink__231_1626357650"/>
+      <w:bookmarkStart w:id="15" w:name="__DdeLink__231_1626357650"/>
       <w:r>
         <w:rPr>
           <w:b w:val="false"/>
@@ -2700,7 +2701,7 @@
         </w:rPr>
         <w:t>Users of all user_roles can use findOneChain.</w:t>
       </w:r>
-      <w:bookmarkEnd w:id="14"/>
+      <w:bookmarkEnd w:id="15"/>
     </w:p>
     <w:p>
       <w:pPr>
@@ -2764,7 +2765,7 @@
           <w:bCs w:val="false"/>
         </w:rPr>
       </w:pPr>
-      <w:bookmarkStart w:id="15" w:name="__DdeLink__240_1626357650"/>
+      <w:bookmarkStart w:id="16" w:name="__DdeLink__240_1626357650"/>
       <w:r>
         <w:rPr>
           <w:b w:val="false"/>
@@ -2772,7 +2773,7 @@
         </w:rPr>
         <w:t>removeChain  -&gt; Takes the chain_id from the URL parameter from the front-end, deletes the respective CHAIN record and returns the deleted CHAIN record. This can only be done by a company_manager or a chain_manager. If it is done by a chain_manager, then that chain_manager must belong to an outlet of the chain which is being removed.</w:t>
       </w:r>
-      <w:bookmarkEnd w:id="15"/>
+      <w:bookmarkEnd w:id="16"/>
       <w:r>
         <w:rPr>
           <w:b w:val="false"/>
@@ -2783,6 +2784,7 @@
       <w:bookmarkEnd w:id="6"/>
       <w:bookmarkEnd w:id="7"/>
       <w:bookmarkEnd w:id="8"/>
+      <w:bookmarkEnd w:id="9"/>
     </w:p>
     <w:p>
       <w:pPr>
@@ -2945,12 +2947,12 @@
         <w:jc w:val="start"/>
         <w:rPr/>
       </w:pPr>
-      <w:bookmarkStart w:id="16" w:name="__DdeLink__92_3803631280"/>
+      <w:bookmarkStart w:id="17" w:name="__DdeLink__92_3803631280"/>
       <w:r>
         <w:rPr/>
         <w:t>* Create a CHAIN tuple without the chain_headquarters_address_city.</w:t>
       </w:r>
-      <w:bookmarkEnd w:id="16"/>
+      <w:bookmarkEnd w:id="17"/>
     </w:p>
     <w:p>
       <w:pPr>
@@ -3053,12 +3055,12 @@
         <w:jc w:val="start"/>
         <w:rPr/>
       </w:pPr>
-      <w:bookmarkStart w:id="17" w:name="__DdeLink__100_3803631280"/>
+      <w:bookmarkStart w:id="18" w:name="__DdeLink__100_3803631280"/>
       <w:r>
         <w:rPr/>
         <w:t>For UpdateChainAddress, the following tests:</w:t>
       </w:r>
-      <w:bookmarkEnd w:id="17"/>
+      <w:bookmarkEnd w:id="18"/>
     </w:p>
     <w:p>
       <w:pPr>
@@ -3079,12 +3081,12 @@
         <w:jc w:val="start"/>
         <w:rPr/>
       </w:pPr>
-      <w:bookmarkStart w:id="18" w:name="__DdeLink__94_3803631280"/>
+      <w:bookmarkStart w:id="19" w:name="__DdeLink__94_3803631280"/>
       <w:r>
         <w:rPr/>
         <w:t>* Update the CHAIN’s chain_headquarters_address_city.</w:t>
       </w:r>
-      <w:bookmarkEnd w:id="18"/>
+      <w:bookmarkEnd w:id="19"/>
     </w:p>
     <w:p>
       <w:pPr>
@@ -3097,12 +3099,12 @@
         <w:rPr/>
         <w:t xml:space="preserve">* </w:t>
       </w:r>
-      <w:bookmarkStart w:id="19" w:name="__DdeLink__96_3803631280"/>
+      <w:bookmarkStart w:id="20" w:name="__DdeLink__96_3803631280"/>
       <w:r>
         <w:rPr/>
         <w:t>Update the CHAIN’s chain_headquarters_address_street</w:t>
       </w:r>
-      <w:bookmarkEnd w:id="19"/>
+      <w:bookmarkEnd w:id="20"/>
       <w:r>
         <w:rPr/>
         <w:t>.</w:t>
@@ -3115,12 +3117,12 @@
         <w:jc w:val="start"/>
         <w:rPr/>
       </w:pPr>
-      <w:bookmarkStart w:id="20" w:name="__DdeLink__98_3803631280"/>
+      <w:bookmarkStart w:id="21" w:name="__DdeLink__98_3803631280"/>
       <w:r>
         <w:rPr/>
         <w:t>* Update the CHAIN’s chain_headquarters_address_country.</w:t>
       </w:r>
-      <w:bookmarkEnd w:id="20"/>
+      <w:bookmarkEnd w:id="21"/>
     </w:p>
     <w:p>
       <w:pPr>
@@ -3200,16 +3202,16 @@
         <w:jc w:val="start"/>
         <w:rPr/>
       </w:pPr>
-      <w:bookmarkStart w:id="21" w:name="__DdeLink__296_1992960000"/>
-      <w:bookmarkStart w:id="22" w:name="__DdeLink__142_2312781727"/>
-      <w:bookmarkStart w:id="23" w:name="__DdeLink__139_2312781727"/>
+      <w:bookmarkStart w:id="22" w:name="__DdeLink__296_1992960000"/>
+      <w:bookmarkStart w:id="23" w:name="__DdeLink__142_2312781727"/>
+      <w:bookmarkStart w:id="24" w:name="__DdeLink__139_2312781727"/>
       <w:r>
         <w:rPr/>
         <w:t>* Delete the CHAIN with chain_id 12.</w:t>
       </w:r>
-      <w:bookmarkEnd w:id="21"/>
       <w:bookmarkEnd w:id="22"/>
       <w:bookmarkEnd w:id="23"/>
+      <w:bookmarkEnd w:id="24"/>
     </w:p>
     <w:p>
       <w:pPr>
@@ -3258,12 +3260,12 @@
         <w:jc w:val="start"/>
         <w:rPr/>
       </w:pPr>
-      <w:bookmarkStart w:id="24" w:name="__DdeLink__138_2894387740"/>
+      <w:bookmarkStart w:id="25" w:name="__DdeLink__138_2894387740"/>
       <w:r>
         <w:rPr/>
         <w:t>* Add another CHAIN named “Test Chain” with the following details (chain_date_created_at, chain_headquarters_address_room_no, chain_headquarters_address_building, chain_headquarters_address_street, chain_headquarters_address_city, chain_headquarters_address_admin_division, chain_headquarters_address_country, chain_headquarters_address_post_code) (Test Chain', '14, 'Test Building 2', 'Test Street 2', 'Test City Two', 'Test Division Twoo', 'India', '560001)</w:t>
       </w:r>
-      <w:bookmarkEnd w:id="24"/>
+      <w:bookmarkEnd w:id="25"/>
     </w:p>
     <w:p>
       <w:pPr>
@@ -3332,14 +3334,14 @@
         <w:jc w:val="start"/>
         <w:rPr/>
       </w:pPr>
-      <w:bookmarkStart w:id="25" w:name="__DdeLink__133_2894387740"/>
-      <w:bookmarkStart w:id="26" w:name="__DdeLink__136_2894387740"/>
+      <w:bookmarkStart w:id="26" w:name="__DdeLink__133_2894387740"/>
+      <w:bookmarkStart w:id="27" w:name="__DdeLink__136_2894387740"/>
       <w:r>
         <w:rPr/>
         <w:t>NOTE: “Test Chain” has chain_ id = 4.</w:t>
       </w:r>
-      <w:bookmarkEnd w:id="25"/>
       <w:bookmarkEnd w:id="26"/>
+      <w:bookmarkEnd w:id="27"/>
     </w:p>
     <w:p>
       <w:pPr>
@@ -3465,7 +3467,7 @@
           <w:bCs w:val="false"/>
         </w:rPr>
       </w:pPr>
-      <w:bookmarkStart w:id="27" w:name="__DdeLink__274_3299975041"/>
+      <w:bookmarkStart w:id="28" w:name="__DdeLink__648_3340287881"/>
       <w:r>
         <w:rPr>
           <w:b w:val="false"/>
@@ -3473,6 +3475,7 @@
         </w:rPr>
         <w:t>The following unit tests should take place by bypassing the DTOs and using the methods of chains.service.ts.</w:t>
       </w:r>
+      <w:bookmarkEnd w:id="28"/>
     </w:p>
     <w:p>
       <w:pPr>
@@ -3806,7 +3809,7 @@
         </w:rPr>
         <w:t xml:space="preserve">* Unit test to Update the chain_name </w:t>
       </w:r>
-      <w:bookmarkStart w:id="28" w:name="__DdeLink__253_3299975041"/>
+      <w:bookmarkStart w:id="29" w:name="__DdeLink__253_3299975041"/>
       <w:r>
         <w:rPr>
           <w:b w:val="false"/>
@@ -3814,7 +3817,7 @@
         </w:rPr>
         <w:t>of record with chain_id = 4</w:t>
       </w:r>
-      <w:bookmarkEnd w:id="28"/>
+      <w:bookmarkEnd w:id="29"/>
       <w:r>
         <w:rPr>
           <w:b w:val="false"/>
@@ -3850,7 +3853,7 @@
           <w:bCs w:val="false"/>
         </w:rPr>
       </w:pPr>
-      <w:bookmarkStart w:id="29" w:name="__DdeLink__255_3299975041"/>
+      <w:bookmarkStart w:id="30" w:name="__DdeLink__255_3299975041"/>
       <w:r>
         <w:rPr>
           <w:b w:val="false"/>
@@ -3858,7 +3861,7 @@
         </w:rPr>
         <w:t>* Unit test to Update the chain_headquarters_address_room_no of record with chain_id = 4 to “22” using the updateChainAddress method.</w:t>
       </w:r>
-      <w:bookmarkEnd w:id="29"/>
+      <w:bookmarkEnd w:id="30"/>
     </w:p>
     <w:p>
       <w:pPr>
@@ -3887,7 +3890,7 @@
           <w:bCs w:val="false"/>
         </w:rPr>
       </w:pPr>
-      <w:bookmarkStart w:id="30" w:name="__DdeLink__257_3299975041"/>
+      <w:bookmarkStart w:id="31" w:name="__DdeLink__257_3299975041"/>
       <w:r>
         <w:rPr>
           <w:b w:val="false"/>
@@ -3895,7 +3898,7 @@
         </w:rPr>
         <w:t>* Unit test to Update the chain_headquarters_address_building of record with chain_id = 4 to “CHAIN HQ ADDRESS BUILDING” using the updateChainAddress method.</w:t>
       </w:r>
-      <w:bookmarkEnd w:id="30"/>
+      <w:bookmarkEnd w:id="31"/>
     </w:p>
     <w:p>
       <w:pPr>
@@ -3924,7 +3927,7 @@
           <w:bCs w:val="false"/>
         </w:rPr>
       </w:pPr>
-      <w:bookmarkStart w:id="31" w:name="__DdeLink__259_3299975041"/>
+      <w:bookmarkStart w:id="32" w:name="__DdeLink__259_3299975041"/>
       <w:r>
         <w:rPr>
           <w:b w:val="false"/>
@@ -3932,7 +3935,7 @@
         </w:rPr>
         <w:t>* Unit test to Update the chain_headquarters_address_street of record with chain_id = 4 to “CHAIN HQ ADDRESS STREET” using the updateChainAddress method.</w:t>
       </w:r>
-      <w:bookmarkEnd w:id="31"/>
+      <w:bookmarkEnd w:id="32"/>
     </w:p>
     <w:p>
       <w:pPr>
@@ -3961,7 +3964,7 @@
           <w:bCs w:val="false"/>
         </w:rPr>
       </w:pPr>
-      <w:bookmarkStart w:id="32" w:name="__DdeLink__261_3299975041"/>
+      <w:bookmarkStart w:id="33" w:name="__DdeLink__261_3299975041"/>
       <w:r>
         <w:rPr>
           <w:b w:val="false"/>
@@ -3969,7 +3972,7 @@
         </w:rPr>
         <w:t>* Unit test to Update the chain_headquarters_address_city of record with chain_id = 4 to “CHAIN HQ ADDRESS CITY” using the updateChainAddress method.</w:t>
       </w:r>
-      <w:bookmarkEnd w:id="32"/>
+      <w:bookmarkEnd w:id="33"/>
     </w:p>
     <w:p>
       <w:pPr>
@@ -3998,7 +4001,7 @@
           <w:bCs w:val="false"/>
         </w:rPr>
       </w:pPr>
-      <w:bookmarkStart w:id="33" w:name="__DdeLink__263_3299975041"/>
+      <w:bookmarkStart w:id="34" w:name="__DdeLink__263_3299975041"/>
       <w:r>
         <w:rPr>
           <w:b w:val="false"/>
@@ -4006,7 +4009,7 @@
         </w:rPr>
         <w:t>* Unit test to Update the chain_headquarters_address_admin_division of record with chain_id = 4 to “CHAIN HQ ADDRESS ADMIN DIVISION” using the updateChainAddress method.</w:t>
       </w:r>
-      <w:bookmarkEnd w:id="33"/>
+      <w:bookmarkEnd w:id="34"/>
     </w:p>
     <w:p>
       <w:pPr>
@@ -4035,7 +4038,7 @@
           <w:bCs w:val="false"/>
         </w:rPr>
       </w:pPr>
-      <w:bookmarkStart w:id="34" w:name="__DdeLink__265_3299975041"/>
+      <w:bookmarkStart w:id="35" w:name="__DdeLink__265_3299975041"/>
       <w:r>
         <w:rPr>
           <w:b w:val="false"/>
@@ -4043,7 +4046,7 @@
         </w:rPr>
         <w:t>* Unit test to Update the chain_headquarters_address_country of record with chain_id = 4 to “CHAIN HQ ADDRESS COUNTRY” using the updateChainAddress method.</w:t>
       </w:r>
-      <w:bookmarkEnd w:id="34"/>
+      <w:bookmarkEnd w:id="35"/>
     </w:p>
     <w:p>
       <w:pPr>
@@ -4142,7 +4145,7 @@
           <w:bCs w:val="false"/>
         </w:rPr>
       </w:pPr>
-      <w:bookmarkStart w:id="35" w:name="__DdeLink__274_3299975041"/>
+      <w:bookmarkStart w:id="36" w:name="__DdeLink__274_3299975041"/>
       <w:r>
         <w:rPr>
           <w:b w:val="false"/>
@@ -4150,7 +4153,7 @@
         </w:rPr>
         <w:t>* Unit test to remove the chain with chain_id = 4 using the removeChain method.</w:t>
       </w:r>
-      <w:bookmarkEnd w:id="35"/>
+      <w:bookmarkEnd w:id="36"/>
     </w:p>
     <w:p>
       <w:pPr>

</xml_diff>

<commit_message>
Added User Unit tests to User API specifications.
</commit_message>
<xml_diff>
--- a/Portal_Database_Design/APIs/Chain_APIs.docx
+++ b/Portal_Database_Design/APIs/Chain_APIs.docx
@@ -2156,8 +2156,8 @@
                 <w:u w:val="none"/>
               </w:rPr>
             </w:pPr>
-            <w:bookmarkStart w:id="4" w:name="__DdeLink__199_1060888073"/>
-            <w:bookmarkStart w:id="5" w:name="__DdeLink__202_1060888073"/>
+            <w:bookmarkStart w:id="4" w:name="__DdeLink__202_1060888073"/>
+            <w:bookmarkStart w:id="5" w:name="__DdeLink__199_1060888073"/>
             <w:r>
               <w:rPr>
                 <w:b w:val="false"/>
@@ -2518,10 +2518,10 @@
           <w:bCs w:val="false"/>
         </w:rPr>
       </w:pPr>
-      <w:bookmarkStart w:id="6" w:name="__DdeLink__261_1626357650"/>
-      <w:bookmarkStart w:id="7" w:name="__DdeLink__251_1626357650"/>
-      <w:bookmarkStart w:id="8" w:name="__DdeLink__264_761320732"/>
-      <w:bookmarkStart w:id="9" w:name="__DdeLink__314_2117206406"/>
+      <w:bookmarkStart w:id="6" w:name="__DdeLink__314_2117206406"/>
+      <w:bookmarkStart w:id="7" w:name="__DdeLink__264_761320732"/>
+      <w:bookmarkStart w:id="8" w:name="__DdeLink__251_1626357650"/>
+      <w:bookmarkStart w:id="9" w:name="__DdeLink__261_1626357650"/>
       <w:r>
         <w:rPr>
           <w:b w:val="false"/>
@@ -3202,9 +3202,9 @@
         <w:jc w:val="start"/>
         <w:rPr/>
       </w:pPr>
-      <w:bookmarkStart w:id="22" w:name="__DdeLink__296_1992960000"/>
+      <w:bookmarkStart w:id="22" w:name="__DdeLink__139_2312781727"/>
       <w:bookmarkStart w:id="23" w:name="__DdeLink__142_2312781727"/>
-      <w:bookmarkStart w:id="24" w:name="__DdeLink__139_2312781727"/>
+      <w:bookmarkStart w:id="24" w:name="__DdeLink__296_1992960000"/>
       <w:r>
         <w:rPr/>
         <w:t>* Delete the CHAIN with chain_id 12.</w:t>
@@ -3334,8 +3334,8 @@
         <w:jc w:val="start"/>
         <w:rPr/>
       </w:pPr>
-      <w:bookmarkStart w:id="26" w:name="__DdeLink__133_2894387740"/>
-      <w:bookmarkStart w:id="27" w:name="__DdeLink__136_2894387740"/>
+      <w:bookmarkStart w:id="26" w:name="__DdeLink__136_2894387740"/>
+      <w:bookmarkStart w:id="27" w:name="__DdeLink__133_2894387740"/>
       <w:r>
         <w:rPr/>
         <w:t>NOTE: “Test Chain” has chain_ id = 4.</w:t>
@@ -3467,15 +3467,24 @@
           <w:bCs w:val="false"/>
         </w:rPr>
       </w:pPr>
-      <w:bookmarkStart w:id="28" w:name="__DdeLink__648_3340287881"/>
-      <w:r>
-        <w:rPr>
-          <w:b w:val="false"/>
-          <w:bCs w:val="false"/>
-        </w:rPr>
-        <w:t>The following unit tests should take place by bypassing the DTOs and using the methods of chains.service.ts.</w:t>
+      <w:bookmarkStart w:id="28" w:name="__DdeLink__1014_1430882800"/>
+      <w:bookmarkStart w:id="29" w:name="__DdeLink__648_3340287881"/>
+      <w:r>
+        <w:rPr>
+          <w:b w:val="false"/>
+          <w:bCs w:val="false"/>
+        </w:rPr>
+        <w:t>The following unit tests should take place by bypassing the DTOs and using the methods of</w:t>
       </w:r>
       <w:bookmarkEnd w:id="28"/>
+      <w:r>
+        <w:rPr>
+          <w:b w:val="false"/>
+          <w:bCs w:val="false"/>
+        </w:rPr>
+        <w:t xml:space="preserve"> chains.service.ts.</w:t>
+      </w:r>
+      <w:bookmarkEnd w:id="29"/>
     </w:p>
     <w:p>
       <w:pPr>
@@ -3809,7 +3818,7 @@
         </w:rPr>
         <w:t xml:space="preserve">* Unit test to Update the chain_name </w:t>
       </w:r>
-      <w:bookmarkStart w:id="29" w:name="__DdeLink__253_3299975041"/>
+      <w:bookmarkStart w:id="30" w:name="__DdeLink__253_3299975041"/>
       <w:r>
         <w:rPr>
           <w:b w:val="false"/>
@@ -3817,7 +3826,7 @@
         </w:rPr>
         <w:t>of record with chain_id = 4</w:t>
       </w:r>
-      <w:bookmarkEnd w:id="29"/>
+      <w:bookmarkEnd w:id="30"/>
       <w:r>
         <w:rPr>
           <w:b w:val="false"/>
@@ -3853,7 +3862,7 @@
           <w:bCs w:val="false"/>
         </w:rPr>
       </w:pPr>
-      <w:bookmarkStart w:id="30" w:name="__DdeLink__255_3299975041"/>
+      <w:bookmarkStart w:id="31" w:name="__DdeLink__255_3299975041"/>
       <w:r>
         <w:rPr>
           <w:b w:val="false"/>
@@ -3861,7 +3870,7 @@
         </w:rPr>
         <w:t>* Unit test to Update the chain_headquarters_address_room_no of record with chain_id = 4 to “22” using the updateChainAddress method.</w:t>
       </w:r>
-      <w:bookmarkEnd w:id="30"/>
+      <w:bookmarkEnd w:id="31"/>
     </w:p>
     <w:p>
       <w:pPr>
@@ -3890,7 +3899,7 @@
           <w:bCs w:val="false"/>
         </w:rPr>
       </w:pPr>
-      <w:bookmarkStart w:id="31" w:name="__DdeLink__257_3299975041"/>
+      <w:bookmarkStart w:id="32" w:name="__DdeLink__257_3299975041"/>
       <w:r>
         <w:rPr>
           <w:b w:val="false"/>
@@ -3898,7 +3907,7 @@
         </w:rPr>
         <w:t>* Unit test to Update the chain_headquarters_address_building of record with chain_id = 4 to “CHAIN HQ ADDRESS BUILDING” using the updateChainAddress method.</w:t>
       </w:r>
-      <w:bookmarkEnd w:id="31"/>
+      <w:bookmarkEnd w:id="32"/>
     </w:p>
     <w:p>
       <w:pPr>
@@ -3927,7 +3936,7 @@
           <w:bCs w:val="false"/>
         </w:rPr>
       </w:pPr>
-      <w:bookmarkStart w:id="32" w:name="__DdeLink__259_3299975041"/>
+      <w:bookmarkStart w:id="33" w:name="__DdeLink__259_3299975041"/>
       <w:r>
         <w:rPr>
           <w:b w:val="false"/>
@@ -3935,7 +3944,7 @@
         </w:rPr>
         <w:t>* Unit test to Update the chain_headquarters_address_street of record with chain_id = 4 to “CHAIN HQ ADDRESS STREET” using the updateChainAddress method.</w:t>
       </w:r>
-      <w:bookmarkEnd w:id="32"/>
+      <w:bookmarkEnd w:id="33"/>
     </w:p>
     <w:p>
       <w:pPr>
@@ -3964,7 +3973,7 @@
           <w:bCs w:val="false"/>
         </w:rPr>
       </w:pPr>
-      <w:bookmarkStart w:id="33" w:name="__DdeLink__261_3299975041"/>
+      <w:bookmarkStart w:id="34" w:name="__DdeLink__261_3299975041"/>
       <w:r>
         <w:rPr>
           <w:b w:val="false"/>
@@ -3972,7 +3981,7 @@
         </w:rPr>
         <w:t>* Unit test to Update the chain_headquarters_address_city of record with chain_id = 4 to “CHAIN HQ ADDRESS CITY” using the updateChainAddress method.</w:t>
       </w:r>
-      <w:bookmarkEnd w:id="33"/>
+      <w:bookmarkEnd w:id="34"/>
     </w:p>
     <w:p>
       <w:pPr>
@@ -4001,7 +4010,7 @@
           <w:bCs w:val="false"/>
         </w:rPr>
       </w:pPr>
-      <w:bookmarkStart w:id="34" w:name="__DdeLink__263_3299975041"/>
+      <w:bookmarkStart w:id="35" w:name="__DdeLink__263_3299975041"/>
       <w:r>
         <w:rPr>
           <w:b w:val="false"/>
@@ -4009,7 +4018,7 @@
         </w:rPr>
         <w:t>* Unit test to Update the chain_headquarters_address_admin_division of record with chain_id = 4 to “CHAIN HQ ADDRESS ADMIN DIVISION” using the updateChainAddress method.</w:t>
       </w:r>
-      <w:bookmarkEnd w:id="34"/>
+      <w:bookmarkEnd w:id="35"/>
     </w:p>
     <w:p>
       <w:pPr>
@@ -4038,7 +4047,7 @@
           <w:bCs w:val="false"/>
         </w:rPr>
       </w:pPr>
-      <w:bookmarkStart w:id="35" w:name="__DdeLink__265_3299975041"/>
+      <w:bookmarkStart w:id="36" w:name="__DdeLink__265_3299975041"/>
       <w:r>
         <w:rPr>
           <w:b w:val="false"/>
@@ -4046,7 +4055,7 @@
         </w:rPr>
         <w:t>* Unit test to Update the chain_headquarters_address_country of record with chain_id = 4 to “CHAIN HQ ADDRESS COUNTRY” using the updateChainAddress method.</w:t>
       </w:r>
-      <w:bookmarkEnd w:id="35"/>
+      <w:bookmarkEnd w:id="36"/>
     </w:p>
     <w:p>
       <w:pPr>
@@ -4145,7 +4154,7 @@
           <w:bCs w:val="false"/>
         </w:rPr>
       </w:pPr>
-      <w:bookmarkStart w:id="36" w:name="__DdeLink__274_3299975041"/>
+      <w:bookmarkStart w:id="37" w:name="__DdeLink__274_3299975041"/>
       <w:r>
         <w:rPr>
           <w:b w:val="false"/>
@@ -4153,7 +4162,7 @@
         </w:rPr>
         <w:t>* Unit test to remove the chain with chain_id = 4 using the removeChain method.</w:t>
       </w:r>
-      <w:bookmarkEnd w:id="36"/>
+      <w:bookmarkEnd w:id="37"/>
     </w:p>
     <w:p>
       <w:pPr>
@@ -4210,7 +4219,7 @@
     <w:pPr>
       <w:widowControl/>
       <w:suppressAutoHyphens w:val="true"/>
-      <w:overflowPunct w:val="true"/>
+      <w:overflowPunct w:val="false"/>
       <w:bidi w:val="0"/>
       <w:spacing w:before="0" w:after="0"/>
       <w:jc w:val="start"/>

</xml_diff>